<commit_message>
Del-1: Rapport completed and pdf copy created
</commit_message>
<xml_diff>
--- a/Del_1-Rapport/Del_1_Rapport.docx
+++ b/Del_1-Rapport/Del_1_Rapport.docx
@@ -279,43 +279,23 @@
     </w:p>
     <w:p>
       <w:pPr>
-        <w:pStyle w:val="Heading3"/>
-        <w:rPr>
-          <w:lang w:val="sv-SE"/>
-        </w:rPr>
-      </w:pPr>
-      <w:r>
-        <w:rPr>
-          <w:lang w:val="sv-SE"/>
-        </w:rPr>
-        <w:t>Fördelar och utmaningar med CI</w:t>
-      </w:r>
+        <w:rPr>
+          <w:lang w:val="sv-SE"/>
+        </w:rPr>
+      </w:pPr>
     </w:p>
     <w:p>
       <w:pPr>
-        <w:rPr>
-          <w:lang w:val="sv-SE"/>
-        </w:rPr>
-      </w:pPr>
-      <w:r>
-        <w:rPr>
-          <w:lang w:val="sv-SE"/>
-        </w:rPr>
-        <w:t xml:space="preserve">Fördelarna med CI är bland annat återkoppling på kodändringar, stabilare </w:t>
-      </w:r>
-      <w:proofErr w:type="spellStart"/>
-      <w:r>
-        <w:rPr>
-          <w:lang w:val="sv-SE"/>
-        </w:rPr>
-        <w:t>kodbas</w:t>
-      </w:r>
-      <w:proofErr w:type="spellEnd"/>
-      <w:r>
-        <w:rPr>
-          <w:lang w:val="sv-SE"/>
-        </w:rPr>
-        <w:t xml:space="preserve"> och minskad risk för integrationsproblem. Utvecklare får snabbt veta om deras kod orsaker fel. </w:t>
+        <w:pStyle w:val="Heading3"/>
+        <w:rPr>
+          <w:lang w:val="sv-SE"/>
+        </w:rPr>
+      </w:pPr>
+      <w:r>
+        <w:rPr>
+          <w:lang w:val="sv-SE"/>
+        </w:rPr>
+        <w:t>Fördelar och utmaningar med CI</w:t>
       </w:r>
     </w:p>
     <w:p>
@@ -328,7 +308,21 @@
         <w:rPr>
           <w:lang w:val="sv-SE"/>
         </w:rPr>
-        <w:t xml:space="preserve">Utmaningar med CI är att det kräver initial konfiguration och underhåll. Om tester är instabila kan de ge falska fel, vilket kan minska förtroendet för CI-systemet. Långa testsviter kan även leda till längre byggtider. </w:t>
+        <w:t xml:space="preserve">Fördelarna med CI är bland annat återkoppling på kodändringar, stabilare </w:t>
+      </w:r>
+      <w:proofErr w:type="spellStart"/>
+      <w:r>
+        <w:rPr>
+          <w:lang w:val="sv-SE"/>
+        </w:rPr>
+        <w:t>kodbas</w:t>
+      </w:r>
+      <w:proofErr w:type="spellEnd"/>
+      <w:r>
+        <w:rPr>
+          <w:lang w:val="sv-SE"/>
+        </w:rPr>
+        <w:t xml:space="preserve"> och minskad risk för integrationsproblem. Utvecklare får snabbt veta om deras kod orsaker fel. </w:t>
       </w:r>
     </w:p>
     <w:p>
@@ -337,20 +331,19 @@
           <w:lang w:val="sv-SE"/>
         </w:rPr>
       </w:pPr>
+      <w:r>
+        <w:rPr>
+          <w:lang w:val="sv-SE"/>
+        </w:rPr>
+        <w:t xml:space="preserve">Utmaningar med CI är att det kräver initial konfiguration och underhåll. Om tester är instabila kan de ge falska fel, vilket kan minska förtroendet för CI-systemet. Långa testsviter kan även leda till längre byggtider. </w:t>
+      </w:r>
     </w:p>
     <w:p>
       <w:pPr>
-        <w:pStyle w:val="Heading3"/>
-        <w:rPr>
-          <w:lang w:val="sv-SE"/>
-        </w:rPr>
-      </w:pPr>
-      <w:r>
-        <w:rPr>
-          <w:lang w:val="sv-SE"/>
-        </w:rPr>
-        <w:t xml:space="preserve">Vad är testautomatisering? </w:t>
-      </w:r>
+        <w:rPr>
+          <w:lang w:val="sv-SE"/>
+        </w:rPr>
+      </w:pPr>
     </w:p>
     <w:p>
       <w:pPr>
@@ -358,43 +351,10 @@
           <w:lang w:val="sv-SE"/>
         </w:rPr>
       </w:pPr>
-      <w:r>
-        <w:rPr>
-          <w:lang w:val="sv-SE"/>
-        </w:rPr>
-        <w:t xml:space="preserve">Testautomatisering innebär att tester körs automatiskt av en maskin </w:t>
-      </w:r>
-      <w:proofErr w:type="gramStart"/>
-      <w:r>
-        <w:rPr>
-          <w:lang w:val="sv-SE"/>
-        </w:rPr>
-        <w:t>istället</w:t>
-      </w:r>
-      <w:proofErr w:type="gramEnd"/>
-      <w:r>
-        <w:rPr>
-          <w:lang w:val="sv-SE"/>
-        </w:rPr>
-        <w:t xml:space="preserve"> för manuellt av en person. Testerna skrivs som kod och kan köras om och om igen utan extra arbetsinsats. Testautomatisering avvänds för att automatiskt testa funktionalitet, </w:t>
-      </w:r>
-      <w:proofErr w:type="spellStart"/>
-      <w:r>
-        <w:rPr>
-          <w:lang w:val="sv-SE"/>
-        </w:rPr>
-        <w:t>API:er</w:t>
-      </w:r>
-      <w:proofErr w:type="spellEnd"/>
-      <w:r>
-        <w:rPr>
-          <w:lang w:val="sv-SE"/>
-        </w:rPr>
-        <w:t xml:space="preserve">, UI, Integrationer och Prestanda. </w:t>
-      </w:r>
     </w:p>
     <w:p>
       <w:pPr>
+        <w:pStyle w:val="Heading3"/>
         <w:rPr>
           <w:lang w:val="sv-SE"/>
         </w:rPr>
@@ -404,6 +364,60 @@
           <w:lang w:val="sv-SE"/>
         </w:rPr>
         <w:lastRenderedPageBreak/>
+        <w:t xml:space="preserve">Vad är testautomatisering? </w:t>
+      </w:r>
+    </w:p>
+    <w:p>
+      <w:pPr>
+        <w:rPr>
+          <w:lang w:val="sv-SE"/>
+        </w:rPr>
+      </w:pPr>
+      <w:r>
+        <w:rPr>
+          <w:lang w:val="sv-SE"/>
+        </w:rPr>
+        <w:t xml:space="preserve">Testautomatisering innebär att tester körs automatiskt av en maskin </w:t>
+      </w:r>
+      <w:proofErr w:type="gramStart"/>
+      <w:r>
+        <w:rPr>
+          <w:lang w:val="sv-SE"/>
+        </w:rPr>
+        <w:t>istället</w:t>
+      </w:r>
+      <w:proofErr w:type="gramEnd"/>
+      <w:r>
+        <w:rPr>
+          <w:lang w:val="sv-SE"/>
+        </w:rPr>
+        <w:t xml:space="preserve"> för manuellt av en person. Testerna skrivs som kod och kan köras om och om igen utan extra arbetsinsats. Testautomatisering avvänds för att automatiskt testa funktionalitet, </w:t>
+      </w:r>
+      <w:proofErr w:type="spellStart"/>
+      <w:r>
+        <w:rPr>
+          <w:lang w:val="sv-SE"/>
+        </w:rPr>
+        <w:t>API:er</w:t>
+      </w:r>
+      <w:proofErr w:type="spellEnd"/>
+      <w:r>
+        <w:rPr>
+          <w:lang w:val="sv-SE"/>
+        </w:rPr>
+        <w:t xml:space="preserve">, UI, Integrationer och Prestanda. </w:t>
+      </w:r>
+    </w:p>
+    <w:p>
+      <w:pPr>
+        <w:rPr>
+          <w:lang w:val="sv-SE"/>
+        </w:rPr>
+      </w:pPr>
+      <w:r>
+        <w:rPr>
+          <w:lang w:val="sv-SE"/>
+        </w:rPr>
         <w:t>Testautomatisering är en central del av CI eftersom CI bygger på att tester körs automatiskt vid varje kodändring. Utan automatiserade tester kan CI inte ge snabb och tillförl</w:t>
       </w:r>
       <w:r>
@@ -834,8 +848,30 @@
         <w:rPr>
           <w:lang w:val="sv-SE"/>
         </w:rPr>
-        <w:t>mappen  .github/workflows</w:t>
-      </w:r>
+        <w:t>mappen  .</w:t>
+      </w:r>
+      <w:proofErr w:type="spellStart"/>
+      <w:r>
+        <w:rPr>
+          <w:lang w:val="sv-SE"/>
+        </w:rPr>
+        <w:t>github</w:t>
+      </w:r>
+      <w:proofErr w:type="spellEnd"/>
+      <w:r>
+        <w:rPr>
+          <w:lang w:val="sv-SE"/>
+        </w:rPr>
+        <w:t>/</w:t>
+      </w:r>
+      <w:proofErr w:type="spellStart"/>
+      <w:r>
+        <w:rPr>
+          <w:lang w:val="sv-SE"/>
+        </w:rPr>
+        <w:t>workflows</w:t>
+      </w:r>
+      <w:proofErr w:type="spellEnd"/>
       <w:r>
         <w:rPr>
           <w:lang w:val="sv-SE"/>
@@ -942,6 +978,7 @@
         <w:rPr>
           <w:lang w:val="sv-SE"/>
         </w:rPr>
+        <w:lastRenderedPageBreak/>
         <w:t>Stage</w:t>
       </w:r>
       <w:proofErr w:type="spellEnd"/>
@@ -1031,7 +1068,35 @@
         <w:rPr>
           <w:lang w:val="sv-SE"/>
         </w:rPr>
-        <w:t xml:space="preserve"> Actions.  När en utvecklare gör en push eller skapar en pull request, triggas </w:t>
+        <w:t xml:space="preserve"> Actions.  När en utvecklare gör en push eller skapar en </w:t>
+      </w:r>
+      <w:proofErr w:type="spellStart"/>
+      <w:r>
+        <w:rPr>
+          <w:lang w:val="sv-SE"/>
+        </w:rPr>
+        <w:t>pull</w:t>
+      </w:r>
+      <w:proofErr w:type="spellEnd"/>
+      <w:r>
+        <w:rPr>
+          <w:lang w:val="sv-SE"/>
+        </w:rPr>
+        <w:t xml:space="preserve"> </w:t>
+      </w:r>
+      <w:proofErr w:type="spellStart"/>
+      <w:r>
+        <w:rPr>
+          <w:lang w:val="sv-SE"/>
+        </w:rPr>
+        <w:t>request</w:t>
+      </w:r>
+      <w:proofErr w:type="spellEnd"/>
+      <w:r>
+        <w:rPr>
+          <w:lang w:val="sv-SE"/>
+        </w:rPr>
+        <w:t xml:space="preserve">, triggas </w:t>
       </w:r>
       <w:proofErr w:type="spellStart"/>
       <w:r>
@@ -1063,7 +1128,6 @@
         <w:rPr>
           <w:lang w:val="sv-SE"/>
         </w:rPr>
-        <w:lastRenderedPageBreak/>
         <w:t xml:space="preserve">Ett workflow startas. </w:t>
       </w:r>
       <w:proofErr w:type="spellStart"/>
@@ -1168,7 +1232,21 @@
         <w:rPr>
           <w:lang w:val="sv-SE"/>
         </w:rPr>
-        <w:t>. Exempelvis installeras Python med actions/setup-</w:t>
+        <w:t xml:space="preserve">. Exempelvis installeras </w:t>
+      </w:r>
+      <w:proofErr w:type="spellStart"/>
+      <w:r>
+        <w:rPr>
+          <w:lang w:val="sv-SE"/>
+        </w:rPr>
+        <w:t>Python</w:t>
+      </w:r>
+      <w:proofErr w:type="spellEnd"/>
+      <w:r>
+        <w:rPr>
+          <w:lang w:val="sv-SE"/>
+        </w:rPr>
+        <w:t xml:space="preserve"> med actions/setup-</w:t>
       </w:r>
       <w:proofErr w:type="spellStart"/>
       <w:r>
@@ -1288,7 +1366,21 @@
         <w:rPr>
           <w:lang w:val="sv-SE"/>
         </w:rPr>
-        <w:t xml:space="preserve"> pytest. </w:t>
+        <w:t xml:space="preserve"> </w:t>
+      </w:r>
+      <w:proofErr w:type="spellStart"/>
+      <w:r>
+        <w:rPr>
+          <w:lang w:val="sv-SE"/>
+        </w:rPr>
+        <w:t>pytest</w:t>
+      </w:r>
+      <w:proofErr w:type="spellEnd"/>
+      <w:r>
+        <w:rPr>
+          <w:lang w:val="sv-SE"/>
+        </w:rPr>
+        <w:t xml:space="preserve">. </w:t>
       </w:r>
       <w:proofErr w:type="spellStart"/>
       <w:r>
@@ -1596,17 +1688,6 @@
       <w:proofErr w:type="spellEnd"/>
       <w:r>
         <w:t xml:space="preserve"> CI, Continuous Delivery och Continuous Deployment</w:t>
-      </w:r>
-    </w:p>
-    <w:p/>
-    <w:p>
-      <w:proofErr w:type="spellStart"/>
-      <w:r>
-        <w:t>Jämförelsetabell</w:t>
-      </w:r>
-      <w:proofErr w:type="spellEnd"/>
-      <w:r>
-        <w:t xml:space="preserve"> CI vs Continuous Delivery vs Continuous Deployment</w:t>
       </w:r>
     </w:p>
     <w:p>
@@ -1651,6 +1732,7 @@
         </w:drawing>
       </w:r>
     </w:p>
+    <w:p/>
     <w:p>
       <w:pPr>
         <w:rPr>
@@ -1663,6 +1745,7 @@
           <w:bCs/>
           <w:lang w:val="sv-SE"/>
         </w:rPr>
+        <w:lastRenderedPageBreak/>
         <w:t>Continuous Integration (CI)</w:t>
       </w:r>
       <w:r>
@@ -1675,14 +1758,7 @@
         <w:rPr>
           <w:lang w:val="sv-SE"/>
         </w:rPr>
-        <w:t xml:space="preserve">är grunden i ett automatiserat utvecklingsflöde. Det handlar om att bygga och testa koden helt automatiskt varje gång någon gör en ändring. På så sätt upptäcks fel tidigt och man säkerställer att ny kod fungerar tillsammans med det som redan </w:t>
-      </w:r>
-      <w:r>
-        <w:rPr>
-          <w:lang w:val="sv-SE"/>
-        </w:rPr>
-        <w:lastRenderedPageBreak/>
-        <w:t xml:space="preserve">finns. Målet med CI är helt enkelt att hålla kodbasen stabil och undvika överraskningar längre fram. </w:t>
+        <w:t xml:space="preserve">är grunden i ett automatiserat utvecklingsflöde. Det handlar om att bygga och testa koden helt automatiskt varje gång någon gör en ändring. På så sätt upptäcks fel tidigt och man säkerställer att ny kod fungerar tillsammans med det som redan finns. Målet med CI är helt enkelt att hålla kodbasen stabil och undvika överraskningar längre fram. </w:t>
       </w:r>
     </w:p>
     <w:p>
@@ -1691,21 +1767,31 @@
           <w:lang w:val="sv-SE"/>
         </w:rPr>
       </w:pPr>
+      <w:proofErr w:type="spellStart"/>
       <w:r>
         <w:rPr>
           <w:b/>
           <w:bCs/>
           <w:lang w:val="sv-SE"/>
         </w:rPr>
-        <w:t xml:space="preserve">Continuous </w:t>
-      </w:r>
-      <w:proofErr w:type="spellStart"/>
+        <w:t>Continuous</w:t>
+      </w:r>
+      <w:proofErr w:type="spellEnd"/>
       <w:r>
         <w:rPr>
           <w:b/>
           <w:bCs/>
           <w:lang w:val="sv-SE"/>
         </w:rPr>
+        <w:t xml:space="preserve"> </w:t>
+      </w:r>
+      <w:proofErr w:type="spellStart"/>
+      <w:r>
+        <w:rPr>
+          <w:b/>
+          <w:bCs/>
+          <w:lang w:val="sv-SE"/>
+        </w:rPr>
         <w:t>Delivery</w:t>
       </w:r>
       <w:proofErr w:type="spellEnd"/>
@@ -1727,7 +1813,21 @@
         <w:rPr>
           <w:lang w:val="sv-SE"/>
         </w:rPr>
-        <w:t xml:space="preserve"> krävs ett manuellt knapptryck, till exempel efter ett godkännande från ansvariga person eller verksamheten. Feedbackcykeln är också längre än feedbackcykeln för CI samt olika verktyg används för både CI och Continuous </w:t>
+        <w:t xml:space="preserve"> krävs ett manuellt knapptryck, till exempel efter ett godkännande från ansvariga person eller verksamheten. Feedbackcykeln är också längre än feedbackcykeln för CI samt olika verktyg används för både CI och </w:t>
+      </w:r>
+      <w:proofErr w:type="spellStart"/>
+      <w:r>
+        <w:rPr>
+          <w:lang w:val="sv-SE"/>
+        </w:rPr>
+        <w:t>Continuous</w:t>
+      </w:r>
+      <w:proofErr w:type="spellEnd"/>
+      <w:r>
+        <w:rPr>
+          <w:lang w:val="sv-SE"/>
+        </w:rPr>
+        <w:t xml:space="preserve"> </w:t>
       </w:r>
       <w:proofErr w:type="spellStart"/>
       <w:r>
@@ -1862,13 +1962,27 @@
         <w:rPr>
           <w:lang w:val="sv-SE"/>
         </w:rPr>
-        <w:t xml:space="preserve">Kort sagt handlar skillnaden mellan CI, Continuous </w:t>
+        <w:t xml:space="preserve">Kort sagt handlar skillnaden mellan CI, </w:t>
       </w:r>
       <w:proofErr w:type="spellStart"/>
       <w:r>
         <w:rPr>
           <w:lang w:val="sv-SE"/>
         </w:rPr>
+        <w:t>Continuous</w:t>
+      </w:r>
+      <w:proofErr w:type="spellEnd"/>
+      <w:r>
+        <w:rPr>
+          <w:lang w:val="sv-SE"/>
+        </w:rPr>
+        <w:t xml:space="preserve"> </w:t>
+      </w:r>
+      <w:proofErr w:type="spellStart"/>
+      <w:r>
+        <w:rPr>
+          <w:lang w:val="sv-SE"/>
+        </w:rPr>
         <w:t>Delivery</w:t>
       </w:r>
       <w:proofErr w:type="spellEnd"/>
@@ -1876,13 +1990,27 @@
         <w:rPr>
           <w:lang w:val="sv-SE"/>
         </w:rPr>
-        <w:t xml:space="preserve"> och Continuous </w:t>
+        <w:t xml:space="preserve"> och </w:t>
       </w:r>
       <w:proofErr w:type="spellStart"/>
       <w:r>
         <w:rPr>
           <w:lang w:val="sv-SE"/>
         </w:rPr>
+        <w:t>Continuous</w:t>
+      </w:r>
+      <w:proofErr w:type="spellEnd"/>
+      <w:r>
+        <w:rPr>
+          <w:lang w:val="sv-SE"/>
+        </w:rPr>
+        <w:t xml:space="preserve"> </w:t>
+      </w:r>
+      <w:proofErr w:type="spellStart"/>
+      <w:r>
+        <w:rPr>
+          <w:lang w:val="sv-SE"/>
+        </w:rPr>
         <w:t>Deployment</w:t>
       </w:r>
       <w:proofErr w:type="spellEnd"/>
@@ -1890,13 +2018,27 @@
         <w:rPr>
           <w:lang w:val="sv-SE"/>
         </w:rPr>
-        <w:t xml:space="preserve"> om hur längt automatiseringen sträcker sig. CI fokuserar på kvalitet och stabilitet, Continuous </w:t>
+        <w:t xml:space="preserve"> om hur längt automatiseringen sträcker sig. CI fokuserar på kvalitet och stabilitet, </w:t>
       </w:r>
       <w:proofErr w:type="spellStart"/>
       <w:r>
         <w:rPr>
           <w:lang w:val="sv-SE"/>
         </w:rPr>
+        <w:t>Continuous</w:t>
+      </w:r>
+      <w:proofErr w:type="spellEnd"/>
+      <w:r>
+        <w:rPr>
+          <w:lang w:val="sv-SE"/>
+        </w:rPr>
+        <w:t xml:space="preserve"> </w:t>
+      </w:r>
+      <w:proofErr w:type="spellStart"/>
+      <w:r>
+        <w:rPr>
+          <w:lang w:val="sv-SE"/>
+        </w:rPr>
         <w:t>Delivery</w:t>
       </w:r>
       <w:proofErr w:type="spellEnd"/>
@@ -1904,7 +2046,21 @@
         <w:rPr>
           <w:lang w:val="sv-SE"/>
         </w:rPr>
-        <w:t xml:space="preserve"> ser till att systemet är redo för release när som helst och Continuous </w:t>
+        <w:t xml:space="preserve"> ser till att systemet är redo för release när som helst och </w:t>
+      </w:r>
+      <w:proofErr w:type="spellStart"/>
+      <w:r>
+        <w:rPr>
+          <w:lang w:val="sv-SE"/>
+        </w:rPr>
+        <w:t>Continuous</w:t>
+      </w:r>
+      <w:proofErr w:type="spellEnd"/>
+      <w:r>
+        <w:rPr>
+          <w:lang w:val="sv-SE"/>
+        </w:rPr>
+        <w:t xml:space="preserve"> </w:t>
       </w:r>
       <w:proofErr w:type="spellStart"/>
       <w:r>
@@ -1964,25 +2120,331 @@
         <w:rPr>
           <w:lang w:val="sv-SE"/>
         </w:rPr>
-        <w:t>testverktyg påverkar därför både vilka fel som kan upptäckas och hur snabbt man får återkoppling när kod ändras.</w:t>
+        <w:t>testverktyg påverkar därför både vilka fel som kan upptäckas och hur snabbt man får återkoppling när kod ändras</w:t>
+      </w:r>
+      <w:r>
+        <w:rPr>
+          <w:lang w:val="sv-SE"/>
+        </w:rPr>
+        <w:t xml:space="preserve"> samt hur mycket tid man lägga för att felsöka. Här kommer jag att analysera </w:t>
+      </w:r>
+      <w:proofErr w:type="spellStart"/>
+      <w:r>
+        <w:rPr>
+          <w:lang w:val="sv-SE"/>
+        </w:rPr>
+        <w:t>Selenium</w:t>
+      </w:r>
+      <w:proofErr w:type="spellEnd"/>
+      <w:r>
+        <w:rPr>
+          <w:lang w:val="sv-SE"/>
+        </w:rPr>
+        <w:t xml:space="preserve"> + </w:t>
+      </w:r>
+      <w:proofErr w:type="spellStart"/>
+      <w:r>
+        <w:rPr>
+          <w:lang w:val="sv-SE"/>
+        </w:rPr>
+        <w:t>Pytest</w:t>
+      </w:r>
+      <w:proofErr w:type="spellEnd"/>
+      <w:r>
+        <w:rPr>
+          <w:lang w:val="sv-SE"/>
+        </w:rPr>
+        <w:t xml:space="preserve"> vs </w:t>
+      </w:r>
+      <w:proofErr w:type="spellStart"/>
+      <w:r>
+        <w:rPr>
+          <w:lang w:val="sv-SE"/>
+        </w:rPr>
+        <w:t>Playwright</w:t>
+      </w:r>
+      <w:proofErr w:type="spellEnd"/>
+      <w:r>
+        <w:rPr>
+          <w:lang w:val="sv-SE"/>
+        </w:rPr>
+        <w:t xml:space="preserve"> + </w:t>
+      </w:r>
+      <w:proofErr w:type="spellStart"/>
+      <w:r>
+        <w:rPr>
+          <w:lang w:val="sv-SE"/>
+        </w:rPr>
+        <w:t>Pytest</w:t>
+      </w:r>
+      <w:proofErr w:type="spellEnd"/>
+      <w:r>
+        <w:rPr>
+          <w:lang w:val="sv-SE"/>
+        </w:rPr>
+        <w:t xml:space="preserve"> och </w:t>
+      </w:r>
+      <w:proofErr w:type="spellStart"/>
+      <w:r>
+        <w:rPr>
+          <w:lang w:val="sv-SE"/>
+        </w:rPr>
+        <w:t>Pytest</w:t>
+      </w:r>
+      <w:proofErr w:type="spellEnd"/>
+      <w:r>
+        <w:rPr>
+          <w:lang w:val="sv-SE"/>
+        </w:rPr>
+        <w:t xml:space="preserve"> vs </w:t>
+      </w:r>
+      <w:proofErr w:type="spellStart"/>
+      <w:r>
+        <w:rPr>
+          <w:lang w:val="sv-SE"/>
+        </w:rPr>
+        <w:t>Unittest</w:t>
+      </w:r>
+      <w:proofErr w:type="spellEnd"/>
+      <w:r>
+        <w:rPr>
+          <w:lang w:val="sv-SE"/>
+        </w:rPr>
+        <w:t xml:space="preserve">. </w:t>
       </w:r>
     </w:p>
     <w:p>
       <w:pPr>
         <w:rPr>
+          <w:lang w:val="sv-SE"/>
+        </w:rPr>
+      </w:pPr>
+      <w:r>
+        <w:rPr>
+          <w:lang w:val="sv-SE"/>
+        </w:rPr>
+        <w:t xml:space="preserve">Både </w:t>
+      </w:r>
+      <w:proofErr w:type="spellStart"/>
+      <w:r>
+        <w:rPr>
+          <w:lang w:val="sv-SE"/>
+        </w:rPr>
+        <w:t>Playwright</w:t>
+      </w:r>
+      <w:proofErr w:type="spellEnd"/>
+      <w:r>
+        <w:rPr>
+          <w:lang w:val="sv-SE"/>
+        </w:rPr>
+        <w:t xml:space="preserve"> + </w:t>
+      </w:r>
+      <w:proofErr w:type="spellStart"/>
+      <w:r>
+        <w:rPr>
+          <w:lang w:val="sv-SE"/>
+        </w:rPr>
+        <w:t>Pytest</w:t>
+      </w:r>
+      <w:proofErr w:type="spellEnd"/>
+      <w:r>
+        <w:rPr>
+          <w:lang w:val="sv-SE"/>
+        </w:rPr>
+        <w:t xml:space="preserve"> och </w:t>
+      </w:r>
+      <w:proofErr w:type="spellStart"/>
+      <w:r>
+        <w:rPr>
+          <w:lang w:val="sv-SE"/>
+        </w:rPr>
+        <w:t>Selenium</w:t>
+      </w:r>
+      <w:proofErr w:type="spellEnd"/>
+      <w:r>
+        <w:rPr>
+          <w:lang w:val="sv-SE"/>
+        </w:rPr>
+        <w:t xml:space="preserve"> +</w:t>
+      </w:r>
+      <w:proofErr w:type="spellStart"/>
+      <w:r>
+        <w:rPr>
+          <w:lang w:val="sv-SE"/>
+        </w:rPr>
+        <w:t>Pytest</w:t>
+      </w:r>
+      <w:proofErr w:type="spellEnd"/>
+      <w:r>
+        <w:rPr>
+          <w:lang w:val="sv-SE"/>
+        </w:rPr>
+        <w:t xml:space="preserve"> används för automatiserad testning av webbapplikationer i </w:t>
+      </w:r>
+      <w:proofErr w:type="spellStart"/>
+      <w:r>
+        <w:rPr>
+          <w:lang w:val="sv-SE"/>
+        </w:rPr>
+        <w:t>Python</w:t>
+      </w:r>
+      <w:proofErr w:type="spellEnd"/>
+      <w:r>
+        <w:rPr>
+          <w:lang w:val="sv-SE"/>
+        </w:rPr>
+        <w:t xml:space="preserve">. </w:t>
+      </w:r>
+      <w:proofErr w:type="spellStart"/>
+      <w:r>
+        <w:rPr>
+          <w:lang w:val="sv-SE"/>
+        </w:rPr>
+        <w:t>Skillnade</w:t>
+      </w:r>
+      <w:proofErr w:type="spellEnd"/>
+      <w:r>
+        <w:rPr>
+          <w:lang w:val="sv-SE"/>
+        </w:rPr>
+        <w:t xml:space="preserve"> ligger inte i vad dom tester utan i hur mycket arbete som krävs för att få stabila och pålitliga tester. </w:t>
+      </w:r>
+    </w:p>
+    <w:p>
+      <w:pPr>
+        <w:rPr>
+          <w:lang w:val="sv-SE"/>
+        </w:rPr>
+      </w:pPr>
+      <w:proofErr w:type="spellStart"/>
+      <w:r>
+        <w:rPr>
+          <w:lang w:val="sv-SE"/>
+        </w:rPr>
+        <w:t>Pytest</w:t>
+      </w:r>
+      <w:proofErr w:type="spellEnd"/>
+      <w:r>
+        <w:rPr>
+          <w:lang w:val="sv-SE"/>
+        </w:rPr>
+        <w:t xml:space="preserve"> och </w:t>
+      </w:r>
+      <w:proofErr w:type="spellStart"/>
+      <w:r>
+        <w:rPr>
+          <w:lang w:val="sv-SE"/>
+        </w:rPr>
+        <w:t>Unittest</w:t>
+      </w:r>
+      <w:proofErr w:type="spellEnd"/>
+      <w:r>
+        <w:rPr>
+          <w:lang w:val="sv-SE"/>
+        </w:rPr>
+        <w:t xml:space="preserve"> används båda för att skriva och köra tester i </w:t>
+      </w:r>
+      <w:proofErr w:type="spellStart"/>
+      <w:r>
+        <w:rPr>
+          <w:lang w:val="sv-SE"/>
+        </w:rPr>
+        <w:t>Python</w:t>
+      </w:r>
+      <w:proofErr w:type="spellEnd"/>
+      <w:r>
+        <w:rPr>
+          <w:lang w:val="sv-SE"/>
+        </w:rPr>
+        <w:t xml:space="preserve">, men de är byggda med olika </w:t>
+      </w:r>
+      <w:proofErr w:type="spellStart"/>
+      <w:r>
+        <w:rPr>
+          <w:lang w:val="sv-SE"/>
+        </w:rPr>
+        <w:t>mindset</w:t>
+      </w:r>
+      <w:proofErr w:type="spellEnd"/>
+      <w:r>
+        <w:rPr>
+          <w:lang w:val="sv-SE"/>
+        </w:rPr>
+        <w:t xml:space="preserve">. </w:t>
+      </w:r>
+      <w:proofErr w:type="spellStart"/>
+      <w:r>
+        <w:rPr>
+          <w:lang w:val="sv-SE"/>
+        </w:rPr>
+        <w:t>Unittest</w:t>
+      </w:r>
+      <w:proofErr w:type="spellEnd"/>
+      <w:r>
+        <w:rPr>
+          <w:lang w:val="sv-SE"/>
+        </w:rPr>
+        <w:t xml:space="preserve"> prioriterar struktur och formalism medan </w:t>
+      </w:r>
+      <w:proofErr w:type="spellStart"/>
+      <w:r>
+        <w:rPr>
+          <w:lang w:val="sv-SE"/>
+        </w:rPr>
+        <w:t>Pytest</w:t>
+      </w:r>
+      <w:proofErr w:type="spellEnd"/>
+      <w:r>
+        <w:rPr>
+          <w:lang w:val="sv-SE"/>
+        </w:rPr>
+        <w:t xml:space="preserve"> prioriterar läsbarhet och flexibilitet. </w:t>
+      </w:r>
+    </w:p>
+    <w:p>
+      <w:pPr>
+        <w:rPr>
+          <w:lang w:val="sv-SE"/>
+        </w:rPr>
+      </w:pPr>
+    </w:p>
+    <w:p>
+      <w:pPr>
+        <w:rPr>
           <w:b/>
           <w:bCs/>
           <w:lang w:val="sv-SE"/>
         </w:rPr>
       </w:pPr>
+      <w:proofErr w:type="spellStart"/>
       <w:r>
         <w:rPr>
           <w:b/>
           <w:bCs/>
           <w:lang w:val="sv-SE"/>
         </w:rPr>
-        <w:t xml:space="preserve">Pytest-grunden i testautomatiseringen </w:t>
-      </w:r>
+        <w:lastRenderedPageBreak/>
+        <w:t>Playwright</w:t>
+      </w:r>
+      <w:proofErr w:type="spellEnd"/>
+      <w:r>
+        <w:rPr>
+          <w:b/>
+          <w:bCs/>
+          <w:lang w:val="sv-SE"/>
+        </w:rPr>
+        <w:t xml:space="preserve"> + </w:t>
+      </w:r>
+      <w:proofErr w:type="spellStart"/>
+      <w:r>
+        <w:rPr>
+          <w:b/>
+          <w:bCs/>
+          <w:lang w:val="sv-SE"/>
+        </w:rPr>
+        <w:t>Pytest</w:t>
+      </w:r>
+      <w:proofErr w:type="spellEnd"/>
     </w:p>
     <w:p>
       <w:pPr>
@@ -1990,96 +2452,45 @@
           <w:lang w:val="sv-SE"/>
         </w:rPr>
       </w:pPr>
-      <w:r>
-        <w:rPr>
-          <w:lang w:val="sv-SE"/>
-        </w:rPr>
-        <w:t xml:space="preserve">Pytest används som det grundläggande testramverk i projektet. </w:t>
-      </w:r>
-      <w:r>
-        <w:rPr>
-          <w:lang w:val="sv-SE"/>
-        </w:rPr>
-        <w:t xml:space="preserve">Det hanterar testkörning, </w:t>
-      </w:r>
       <w:proofErr w:type="spellStart"/>
       <w:r>
         <w:rPr>
           <w:lang w:val="sv-SE"/>
         </w:rPr>
-        <w:t>assertioner</w:t>
+        <w:t>Playwright</w:t>
       </w:r>
       <w:proofErr w:type="spellEnd"/>
       <w:r>
         <w:rPr>
           <w:lang w:val="sv-SE"/>
         </w:rPr>
-        <w:t xml:space="preserve"> och struktur, vilket gör det enkelt att skriva tydliga och fokuserade tester. </w:t>
-      </w:r>
-    </w:p>
-    <w:p>
-      <w:pPr>
-        <w:rPr>
-          <w:lang w:val="sv-SE"/>
-        </w:rPr>
-      </w:pPr>
-      <w:r>
-        <w:rPr>
-          <w:lang w:val="sv-SE"/>
-        </w:rPr>
-        <w:t xml:space="preserve">Exempel från projektet: </w:t>
-      </w:r>
-    </w:p>
-    <w:p>
-      <w:r>
-        <w:t>def test_get_products_returns_200():</w:t>
-      </w:r>
-    </w:p>
-    <w:p>
-      <w:r>
-        <w:t xml:space="preserve">    response = </w:t>
-      </w:r>
-      <w:r>
-        <w:t xml:space="preserve">requests. </w:t>
-      </w:r>
-      <w:r>
-        <w:t>g</w:t>
-      </w:r>
-      <w:r>
-        <w:t>et</w:t>
-      </w:r>
-      <w:r>
-        <w:t>(f"{BASE_URL}/products")</w:t>
-      </w:r>
-    </w:p>
-    <w:p>
-      <w:pPr>
-        <w:rPr>
-          <w:lang w:val="sv-SE"/>
-        </w:rPr>
-      </w:pPr>
-      <w:r>
-        <w:t xml:space="preserve">    </w:t>
-      </w:r>
-      <w:r>
-        <w:rPr>
-          <w:lang w:val="sv-SE"/>
-        </w:rPr>
-        <w:t xml:space="preserve">assert </w:t>
-      </w:r>
-      <w:proofErr w:type="gramStart"/>
-      <w:r>
-        <w:rPr>
-          <w:lang w:val="sv-SE"/>
-        </w:rPr>
-        <w:t>response.status</w:t>
-      </w:r>
-      <w:proofErr w:type="gramEnd"/>
-      <w:r>
-        <w:rPr>
-          <w:lang w:val="sv-SE"/>
-        </w:rPr>
-        <w:t>_code == 200</w:t>
+        <w:t xml:space="preserve"> är ett modernt verktyg för webbläs</w:t>
+      </w:r>
+      <w:r>
+        <w:rPr>
+          <w:lang w:val="sv-SE"/>
+        </w:rPr>
+        <w:t xml:space="preserve">arautomatisering. </w:t>
+      </w:r>
+      <w:r>
+        <w:rPr>
+          <w:lang w:val="sv-SE"/>
+        </w:rPr>
+        <w:t xml:space="preserve">Tillsammans med </w:t>
+      </w:r>
+      <w:proofErr w:type="spellStart"/>
+      <w:r>
+        <w:rPr>
+          <w:lang w:val="sv-SE"/>
+        </w:rPr>
+        <w:t>Pytest</w:t>
+      </w:r>
+      <w:proofErr w:type="spellEnd"/>
+      <w:r>
+        <w:rPr>
+          <w:lang w:val="sv-SE"/>
+        </w:rPr>
+        <w:t xml:space="preserve"> bildar det en lättviktig och mycket stabil teststack. </w:t>
       </w:r>
     </w:p>
     <w:p>
@@ -2100,31 +2511,10 @@
           <w:iCs/>
           <w:lang w:val="sv-SE"/>
         </w:rPr>
-        <w:t>Fördelar med Pytest</w:t>
-      </w:r>
-    </w:p>
-    <w:p>
-      <w:pPr>
-        <w:rPr>
-          <w:lang w:val="sv-SE"/>
-        </w:rPr>
-      </w:pPr>
-      <w:r>
-        <w:rPr>
-          <w:lang w:val="sv-SE"/>
-        </w:rPr>
-        <w:lastRenderedPageBreak/>
-        <w:t>Testfallen är</w:t>
-      </w:r>
-      <w:r>
-        <w:rPr>
-          <w:lang w:val="sv-SE"/>
-        </w:rPr>
-        <w:t xml:space="preserve"> korta och lätta att förstå, vilket gör dem enkla att underhålla över tid. De körs snabbt i CI och ger direkt feedback vid varje push. När ett test fallerar är det också lätt att se exakt vad som gått fel. Dessutom är testsviten enkel att bygga vidare på när nya funktioner tillkommer. </w:t>
-      </w:r>
-    </w:p>
-    <w:p>
-      <w:pPr>
+        <w:t xml:space="preserve">Fördelar med </w:t>
+      </w:r>
+      <w:proofErr w:type="spellStart"/>
+      <w:r>
         <w:rPr>
           <w:b/>
           <w:bCs/>
@@ -2132,7 +2522,9 @@
           <w:iCs/>
           <w:lang w:val="sv-SE"/>
         </w:rPr>
-      </w:pPr>
+        <w:t>Playwright</w:t>
+      </w:r>
+      <w:proofErr w:type="spellEnd"/>
       <w:r>
         <w:rPr>
           <w:b/>
@@ -2141,178 +2533,10 @@
           <w:iCs/>
           <w:lang w:val="sv-SE"/>
         </w:rPr>
-        <w:t>Nackdelar med Pytest</w:t>
-      </w:r>
-    </w:p>
-    <w:p>
-      <w:pPr>
-        <w:rPr>
-          <w:lang w:val="sv-SE"/>
-        </w:rPr>
-      </w:pPr>
-      <w:r>
-        <w:rPr>
-          <w:lang w:val="sv-SE"/>
-        </w:rPr>
-        <w:t>Pytest är begränsat till Python-projekt, och om testsviten växer utan tydlig struktur kan den bli svår att överblicka</w:t>
-      </w:r>
-      <w:r>
-        <w:rPr>
-          <w:lang w:val="sv-SE"/>
-        </w:rPr>
-        <w:t xml:space="preserve"> men i ett litet projekt som mitt Del-2&amp;3 projekt är lätt att hantera. </w:t>
-      </w:r>
-    </w:p>
-    <w:p>
-      <w:pPr>
-        <w:rPr>
-          <w:lang w:val="sv-SE"/>
-        </w:rPr>
-      </w:pPr>
-    </w:p>
-    <w:p>
-      <w:pPr>
-        <w:rPr>
-          <w:b/>
-          <w:bCs/>
-          <w:lang w:val="sv-SE"/>
-        </w:rPr>
-      </w:pPr>
-      <w:r>
-        <w:rPr>
-          <w:b/>
-          <w:bCs/>
-          <w:lang w:val="sv-SE"/>
-        </w:rPr>
-        <w:t>Request + Pytest för API och integrationstester</w:t>
-      </w:r>
-    </w:p>
-    <w:p>
-      <w:pPr>
-        <w:rPr>
-          <w:lang w:val="sv-SE"/>
-        </w:rPr>
-      </w:pPr>
-      <w:r>
-        <w:rPr>
-          <w:lang w:val="sv-SE"/>
-        </w:rPr>
-        <w:t>Request används i Python för att skicka en http-förfrågan till något utanför programmet. Till exempel API eller en webbtjänst. I mitt projekt används Request tillsammans med pytest för att testa integration</w:t>
-      </w:r>
-      <w:r>
-        <w:rPr>
-          <w:lang w:val="sv-SE"/>
-        </w:rPr>
-        <w:t xml:space="preserve"> mot externa </w:t>
+        <w:t xml:space="preserve"> + </w:t>
       </w:r>
       <w:proofErr w:type="spellStart"/>
       <w:r>
-        <w:rPr>
-          <w:lang w:val="sv-SE"/>
-        </w:rPr>
-        <w:t>API:er</w:t>
-      </w:r>
-      <w:proofErr w:type="spellEnd"/>
-      <w:r>
-        <w:rPr>
-          <w:lang w:val="sv-SE"/>
-        </w:rPr>
-        <w:t xml:space="preserve">, i detta fall fakestoreapi.com. Dessa tester kontrollerar att systemet faktiskt kan kommunicera med externa tjänster och att rätt data returneras. </w:t>
-      </w:r>
-    </w:p>
-    <w:p>
-      <w:pPr>
-        <w:rPr>
-          <w:lang w:val="sv-SE"/>
-        </w:rPr>
-      </w:pPr>
-      <w:r>
-        <w:rPr>
-          <w:lang w:val="sv-SE"/>
-        </w:rPr>
-        <w:t xml:space="preserve">Exempel från mitt projekt: </w:t>
-      </w:r>
-    </w:p>
-    <w:p>
-      <w:r>
-        <w:t xml:space="preserve">def </w:t>
-      </w:r>
-      <w:proofErr w:type="spellStart"/>
-      <w:r>
-        <w:t>test_products_</w:t>
-      </w:r>
-      <w:proofErr w:type="gramStart"/>
-      <w:r>
-        <w:t>count</w:t>
-      </w:r>
-      <w:proofErr w:type="spellEnd"/>
-      <w:r>
-        <w:t>(</w:t>
-      </w:r>
-      <w:proofErr w:type="gramEnd"/>
-      <w:r>
-        <w:t>):</w:t>
-      </w:r>
-    </w:p>
-    <w:p>
-      <w:r>
-        <w:t xml:space="preserve">    response = </w:t>
-      </w:r>
-      <w:proofErr w:type="spellStart"/>
-      <w:r>
-        <w:t>requests.get</w:t>
-      </w:r>
-      <w:proofErr w:type="spellEnd"/>
-      <w:r>
-        <w:t>(</w:t>
-      </w:r>
-      <w:proofErr w:type="gramStart"/>
-      <w:r>
-        <w:t>f"{</w:t>
-      </w:r>
-      <w:proofErr w:type="gramEnd"/>
-      <w:r>
-        <w:t>BASE_</w:t>
-      </w:r>
-      <w:proofErr w:type="gramStart"/>
-      <w:r>
-        <w:t>URL}/</w:t>
-      </w:r>
-      <w:proofErr w:type="gramEnd"/>
-      <w:r>
-        <w:t>products")</w:t>
-      </w:r>
-    </w:p>
-    <w:p>
-      <w:r>
-        <w:t xml:space="preserve">    products = </w:t>
-      </w:r>
-      <w:proofErr w:type="spellStart"/>
-      <w:proofErr w:type="gramStart"/>
-      <w:r>
-        <w:t>response.json</w:t>
-      </w:r>
-      <w:proofErr w:type="spellEnd"/>
-      <w:proofErr w:type="gramEnd"/>
-      <w:r>
-        <w:t>()</w:t>
-      </w:r>
-    </w:p>
-    <w:p>
-      <w:r>
-        <w:t xml:space="preserve">    assert </w:t>
-      </w:r>
-      <w:proofErr w:type="spellStart"/>
-      <w:r>
-        <w:t>len</w:t>
-      </w:r>
-      <w:proofErr w:type="spellEnd"/>
-      <w:r>
-        <w:t>(products) == 20</w:t>
-      </w:r>
-    </w:p>
-    <w:p>
-      <w:pPr>
         <w:rPr>
           <w:b/>
           <w:bCs/>
@@ -2320,8 +2544,176 @@
           <w:iCs/>
           <w:lang w:val="sv-SE"/>
         </w:rPr>
-      </w:pPr>
-      <w:r>
+        <w:t>Pytest</w:t>
+      </w:r>
+      <w:proofErr w:type="spellEnd"/>
+    </w:p>
+    <w:p>
+      <w:pPr>
+        <w:pStyle w:val="ListParagraph"/>
+        <w:numPr>
+          <w:ilvl w:val="1"/>
+          <w:numId w:val="11"/>
+        </w:numPr>
+        <w:rPr>
+          <w:lang w:val="sv-SE"/>
+        </w:rPr>
+      </w:pPr>
+      <w:r>
+        <w:rPr>
+          <w:lang w:val="sv-SE"/>
+        </w:rPr>
+        <w:t xml:space="preserve">Tester beter sig stabilt utan att man </w:t>
+      </w:r>
+      <w:r>
+        <w:rPr>
+          <w:lang w:val="sv-SE"/>
+        </w:rPr>
+        <w:t>hela tiden behöver fundera på</w:t>
+      </w:r>
+      <w:r>
+        <w:rPr>
+          <w:lang w:val="sv-SE"/>
+        </w:rPr>
+        <w:t xml:space="preserve"> väntetider </w:t>
+      </w:r>
+    </w:p>
+    <w:p>
+      <w:pPr>
+        <w:pStyle w:val="ListParagraph"/>
+        <w:numPr>
+          <w:ilvl w:val="1"/>
+          <w:numId w:val="11"/>
+        </w:numPr>
+        <w:rPr>
+          <w:lang w:val="sv-SE"/>
+        </w:rPr>
+      </w:pPr>
+      <w:r>
+        <w:rPr>
+          <w:lang w:val="sv-SE"/>
+        </w:rPr>
+        <w:t>Felsökning tar mindre tid eftersom tester inte faller slumpmässigt</w:t>
+      </w:r>
+    </w:p>
+    <w:p>
+      <w:pPr>
+        <w:pStyle w:val="ListParagraph"/>
+        <w:numPr>
+          <w:ilvl w:val="1"/>
+          <w:numId w:val="11"/>
+        </w:numPr>
+        <w:rPr>
+          <w:lang w:val="sv-SE"/>
+        </w:rPr>
+      </w:pPr>
+      <w:r>
+        <w:rPr>
+          <w:lang w:val="sv-SE"/>
+        </w:rPr>
+        <w:t xml:space="preserve">CI-körning blir jämnare och mer förutsägbara </w:t>
+      </w:r>
+    </w:p>
+    <w:p>
+      <w:pPr>
+        <w:pStyle w:val="ListParagraph"/>
+        <w:numPr>
+          <w:ilvl w:val="1"/>
+          <w:numId w:val="11"/>
+        </w:numPr>
+        <w:rPr>
+          <w:lang w:val="sv-SE"/>
+        </w:rPr>
+      </w:pPr>
+      <w:r>
+        <w:rPr>
+          <w:lang w:val="sv-SE"/>
+        </w:rPr>
+        <w:t xml:space="preserve">Man kan lägga energin på vad som testas och inte på får testerna att överleva </w:t>
+      </w:r>
+      <w:r>
+        <w:rPr>
+          <w:lang w:val="sv-SE"/>
+        </w:rPr>
+        <w:t xml:space="preserve">eller felsöka </w:t>
+      </w:r>
+      <w:proofErr w:type="spellStart"/>
+      <w:r>
+        <w:rPr>
+          <w:lang w:val="sv-SE"/>
+        </w:rPr>
+        <w:t>flaky</w:t>
+      </w:r>
+      <w:proofErr w:type="spellEnd"/>
+      <w:r>
+        <w:rPr>
+          <w:lang w:val="sv-SE"/>
+        </w:rPr>
+        <w:t xml:space="preserve"> tester. </w:t>
+      </w:r>
+    </w:p>
+    <w:p>
+      <w:pPr>
+        <w:pStyle w:val="ListParagraph"/>
+        <w:numPr>
+          <w:ilvl w:val="1"/>
+          <w:numId w:val="11"/>
+        </w:numPr>
+        <w:rPr>
+          <w:lang w:val="sv-SE"/>
+        </w:rPr>
+      </w:pPr>
+      <w:r>
+        <w:rPr>
+          <w:lang w:val="sv-SE"/>
+        </w:rPr>
+        <w:t xml:space="preserve">Snabba körningar både lokalt och i CI (jag gjorde en jämförelse och tid skillnaden för körning av 15 testfall med både </w:t>
+      </w:r>
+      <w:proofErr w:type="spellStart"/>
+      <w:r>
+        <w:rPr>
+          <w:lang w:val="sv-SE"/>
+        </w:rPr>
+        <w:t>selenium</w:t>
+      </w:r>
+      <w:proofErr w:type="spellEnd"/>
+      <w:r>
+        <w:rPr>
+          <w:lang w:val="sv-SE"/>
+        </w:rPr>
+        <w:t xml:space="preserve"> och </w:t>
+      </w:r>
+      <w:proofErr w:type="spellStart"/>
+      <w:r>
+        <w:rPr>
+          <w:lang w:val="sv-SE"/>
+        </w:rPr>
+        <w:t>playwright</w:t>
+      </w:r>
+      <w:proofErr w:type="spellEnd"/>
+      <w:r>
+        <w:rPr>
+          <w:lang w:val="sv-SE"/>
+        </w:rPr>
+        <w:t xml:space="preserve"> </w:t>
+      </w:r>
+      <w:proofErr w:type="spellStart"/>
+      <w:r>
+        <w:rPr>
+          <w:lang w:val="sv-SE"/>
+        </w:rPr>
+        <w:t>was</w:t>
+      </w:r>
+      <w:proofErr w:type="spellEnd"/>
+      <w:r>
+        <w:rPr>
+          <w:lang w:val="sv-SE"/>
+        </w:rPr>
+        <w:t xml:space="preserve"> cirka 35 sekunder)</w:t>
+      </w:r>
+    </w:p>
+    <w:p>
+      <w:pPr>
         <w:rPr>
           <w:b/>
           <w:bCs/>
@@ -2329,8 +2721,7 @@
           <w:iCs/>
           <w:lang w:val="sv-SE"/>
         </w:rPr>
-        <w:t xml:space="preserve">Fördelar med </w:t>
-      </w:r>
+      </w:pPr>
       <w:r>
         <w:rPr>
           <w:b/>
@@ -2339,7 +2730,7 @@
           <w:iCs/>
           <w:lang w:val="sv-SE"/>
         </w:rPr>
-        <w:t xml:space="preserve">Request + </w:t>
+        <w:t xml:space="preserve">Nackdelar </w:t>
       </w:r>
       <w:r>
         <w:rPr>
@@ -2349,30 +2740,10 @@
           <w:iCs/>
           <w:lang w:val="sv-SE"/>
         </w:rPr>
-        <w:t>Pytest</w:t>
-      </w:r>
-    </w:p>
-    <w:p>
-      <w:pPr>
-        <w:rPr>
-          <w:lang w:val="sv-SE"/>
-        </w:rPr>
-      </w:pPr>
-      <w:r>
-        <w:rPr>
-          <w:lang w:val="sv-SE"/>
-        </w:rPr>
-        <w:t xml:space="preserve">Testerna </w:t>
-      </w:r>
-      <w:r>
-        <w:rPr>
-          <w:lang w:val="sv-SE"/>
-        </w:rPr>
-        <w:t xml:space="preserve">verifierar verklig integration, inte bara intern logi. De är betydligt snabbare än UI-tester och kontrollerar både statuskoder och innehållet i svaren. Därför passar de bra som automatiska regressionstester i CI. </w:t>
-      </w:r>
-    </w:p>
-    <w:p>
-      <w:pPr>
+        <w:t xml:space="preserve">med </w:t>
+      </w:r>
+      <w:proofErr w:type="spellStart"/>
+      <w:r>
         <w:rPr>
           <w:b/>
           <w:bCs/>
@@ -2380,7 +2751,9 @@
           <w:iCs/>
           <w:lang w:val="sv-SE"/>
         </w:rPr>
-      </w:pPr>
+        <w:t>Playwright</w:t>
+      </w:r>
+      <w:proofErr w:type="spellEnd"/>
       <w:r>
         <w:rPr>
           <w:b/>
@@ -2389,8 +2762,9 @@
           <w:iCs/>
           <w:lang w:val="sv-SE"/>
         </w:rPr>
-        <w:t>Nack</w:t>
-      </w:r>
+        <w:t xml:space="preserve"> + </w:t>
+      </w:r>
+      <w:proofErr w:type="spellStart"/>
       <w:r>
         <w:rPr>
           <w:b/>
@@ -2399,9 +2773,243 @@
           <w:iCs/>
           <w:lang w:val="sv-SE"/>
         </w:rPr>
-        <w:t xml:space="preserve">delar med </w:t>
-      </w:r>
-      <w:r>
+        <w:t>Pytest</w:t>
+      </w:r>
+      <w:proofErr w:type="spellEnd"/>
+    </w:p>
+    <w:p>
+      <w:pPr>
+        <w:pStyle w:val="ListParagraph"/>
+        <w:numPr>
+          <w:ilvl w:val="1"/>
+          <w:numId w:val="11"/>
+        </w:numPr>
+        <w:rPr>
+          <w:lang w:val="sv-SE"/>
+        </w:rPr>
+      </w:pPr>
+      <w:r>
+        <w:rPr>
+          <w:lang w:val="sv-SE"/>
+        </w:rPr>
+        <w:t xml:space="preserve">Ingen riktig Safari, bara </w:t>
+      </w:r>
+      <w:proofErr w:type="spellStart"/>
+      <w:r>
+        <w:rPr>
+          <w:lang w:val="sv-SE"/>
+        </w:rPr>
+        <w:t>Webkit</w:t>
+      </w:r>
+      <w:proofErr w:type="spellEnd"/>
+      <w:r>
+        <w:rPr>
+          <w:lang w:val="sv-SE"/>
+        </w:rPr>
+        <w:t xml:space="preserve">. </w:t>
+      </w:r>
+      <w:proofErr w:type="spellStart"/>
+      <w:r>
+        <w:rPr>
+          <w:lang w:val="sv-SE"/>
+        </w:rPr>
+        <w:t>Playwright</w:t>
+      </w:r>
+      <w:proofErr w:type="spellEnd"/>
+      <w:r>
+        <w:rPr>
+          <w:lang w:val="sv-SE"/>
+        </w:rPr>
+        <w:t xml:space="preserve"> kan köra </w:t>
+      </w:r>
+      <w:proofErr w:type="spellStart"/>
+      <w:r>
+        <w:rPr>
+          <w:lang w:val="sv-SE"/>
+        </w:rPr>
+        <w:t>Webkit</w:t>
+      </w:r>
+      <w:proofErr w:type="spellEnd"/>
+      <w:r>
+        <w:rPr>
+          <w:lang w:val="sv-SE"/>
+        </w:rPr>
+        <w:t xml:space="preserve">, vilken ligger nära safari men det är inte samma sak som at testa I Apples faktiska Safari-browser. Detta har själv inte testa men dom flesta som har testat detta tycker samma. </w:t>
+      </w:r>
+    </w:p>
+    <w:p>
+      <w:pPr>
+        <w:pStyle w:val="ListParagraph"/>
+        <w:numPr>
+          <w:ilvl w:val="1"/>
+          <w:numId w:val="11"/>
+        </w:numPr>
+        <w:rPr>
+          <w:lang w:val="sv-SE"/>
+        </w:rPr>
+      </w:pPr>
+      <w:r>
+        <w:rPr>
+          <w:lang w:val="sv-SE"/>
+        </w:rPr>
+        <w:t xml:space="preserve">Nyare verktyg med kortare historik än </w:t>
+      </w:r>
+      <w:proofErr w:type="spellStart"/>
+      <w:r>
+        <w:rPr>
+          <w:lang w:val="sv-SE"/>
+        </w:rPr>
+        <w:t>Selenium</w:t>
+      </w:r>
+      <w:proofErr w:type="spellEnd"/>
+      <w:r>
+        <w:rPr>
+          <w:lang w:val="sv-SE"/>
+        </w:rPr>
+        <w:t xml:space="preserve">. </w:t>
+      </w:r>
+    </w:p>
+    <w:p>
+      <w:pPr>
+        <w:pStyle w:val="ListParagraph"/>
+        <w:numPr>
+          <w:ilvl w:val="1"/>
+          <w:numId w:val="11"/>
+        </w:numPr>
+        <w:rPr>
+          <w:lang w:val="sv-SE"/>
+        </w:rPr>
+      </w:pPr>
+      <w:r>
+        <w:rPr>
+          <w:lang w:val="sv-SE"/>
+        </w:rPr>
+        <w:t xml:space="preserve">Mindre </w:t>
+      </w:r>
+      <w:proofErr w:type="spellStart"/>
+      <w:r>
+        <w:rPr>
+          <w:lang w:val="sv-SE"/>
+        </w:rPr>
+        <w:t>community</w:t>
+      </w:r>
+      <w:proofErr w:type="spellEnd"/>
+      <w:r>
+        <w:rPr>
+          <w:lang w:val="sv-SE"/>
+        </w:rPr>
+        <w:t xml:space="preserve"> och färre färdiga svar. </w:t>
+      </w:r>
+    </w:p>
+    <w:p>
+      <w:pPr>
+        <w:rPr>
+          <w:lang w:val="sv-SE"/>
+        </w:rPr>
+      </w:pPr>
+    </w:p>
+    <w:p>
+      <w:pPr>
+        <w:rPr>
+          <w:b/>
+          <w:bCs/>
+          <w:lang w:val="sv-SE"/>
+        </w:rPr>
+      </w:pPr>
+      <w:proofErr w:type="spellStart"/>
+      <w:r>
+        <w:rPr>
+          <w:b/>
+          <w:bCs/>
+          <w:lang w:val="sv-SE"/>
+        </w:rPr>
+        <w:t>Selenium</w:t>
+      </w:r>
+      <w:proofErr w:type="spellEnd"/>
+      <w:r>
+        <w:rPr>
+          <w:b/>
+          <w:bCs/>
+          <w:lang w:val="sv-SE"/>
+        </w:rPr>
+        <w:t xml:space="preserve"> + </w:t>
+      </w:r>
+      <w:proofErr w:type="spellStart"/>
+      <w:r>
+        <w:rPr>
+          <w:b/>
+          <w:bCs/>
+          <w:lang w:val="sv-SE"/>
+        </w:rPr>
+        <w:t>Pytest</w:t>
+      </w:r>
+      <w:proofErr w:type="spellEnd"/>
+    </w:p>
+    <w:p>
+      <w:pPr>
+        <w:rPr>
+          <w:lang w:val="sv-SE"/>
+        </w:rPr>
+      </w:pPr>
+      <w:proofErr w:type="spellStart"/>
+      <w:r>
+        <w:rPr>
+          <w:lang w:val="sv-SE"/>
+        </w:rPr>
+        <w:t>Selenium</w:t>
+      </w:r>
+      <w:proofErr w:type="spellEnd"/>
+      <w:r>
+        <w:rPr>
+          <w:lang w:val="sv-SE"/>
+        </w:rPr>
+        <w:t xml:space="preserve"> är ett välkänt och välprövat verktyg. Tillsammans med </w:t>
+      </w:r>
+      <w:proofErr w:type="spellStart"/>
+      <w:r>
+        <w:rPr>
+          <w:lang w:val="sv-SE"/>
+        </w:rPr>
+        <w:t>Pytest</w:t>
+      </w:r>
+      <w:proofErr w:type="spellEnd"/>
+      <w:r>
+        <w:rPr>
+          <w:lang w:val="sv-SE"/>
+        </w:rPr>
+        <w:t xml:space="preserve"> blir det betydligt mer användarvänligt än </w:t>
+      </w:r>
+      <w:proofErr w:type="spellStart"/>
+      <w:r>
+        <w:rPr>
+          <w:lang w:val="sv-SE"/>
+        </w:rPr>
+        <w:t>Selenium</w:t>
+      </w:r>
+      <w:proofErr w:type="spellEnd"/>
+      <w:r>
+        <w:rPr>
+          <w:lang w:val="sv-SE"/>
+        </w:rPr>
+        <w:t xml:space="preserve"> med </w:t>
+      </w:r>
+      <w:proofErr w:type="spellStart"/>
+      <w:r>
+        <w:rPr>
+          <w:lang w:val="sv-SE"/>
+        </w:rPr>
+        <w:t>Unittest</w:t>
+      </w:r>
+      <w:proofErr w:type="spellEnd"/>
+      <w:r>
+        <w:rPr>
+          <w:lang w:val="sv-SE"/>
+        </w:rPr>
+        <w:t>.</w:t>
+      </w:r>
+    </w:p>
+    <w:p>
+      <w:pPr>
         <w:rPr>
           <w:b/>
           <w:bCs/>
@@ -2409,8 +3017,7 @@
           <w:iCs/>
           <w:lang w:val="sv-SE"/>
         </w:rPr>
-        <w:t xml:space="preserve">Request + </w:t>
-      </w:r>
+      </w:pPr>
       <w:r>
         <w:rPr>
           <w:b/>
@@ -2419,307 +3026,79 @@
           <w:iCs/>
           <w:lang w:val="sv-SE"/>
         </w:rPr>
-        <w:t>Pytest</w:t>
-      </w:r>
-    </w:p>
-    <w:p>
-      <w:pPr>
-        <w:rPr>
-          <w:lang w:val="sv-SE"/>
-        </w:rPr>
-      </w:pPr>
-      <w:r>
-        <w:rPr>
-          <w:lang w:val="sv-SE"/>
-        </w:rPr>
-        <w:t>Eftersom testerna beror på externa system kan de</w:t>
-      </w:r>
-      <w:r>
-        <w:rPr>
-          <w:lang w:val="sv-SE"/>
-        </w:rPr>
-        <w:t>t</w:t>
-      </w:r>
-      <w:r>
-        <w:rPr>
-          <w:lang w:val="sv-SE"/>
-        </w:rPr>
-        <w:t xml:space="preserve"> ibland fungera dåligt. Problem med nätverket eller begränsad åtkomst, till exempel statuskod 403, kan göra att tester misslyckas trots att koden är korrekt. För att undvika detta kan man ibland behöva simulera externa system eller </w:t>
-      </w:r>
-      <w:r>
-        <w:rPr>
-          <w:lang w:val="sv-SE"/>
-        </w:rPr>
-        <w:t>ser till att</w:t>
-      </w:r>
-      <w:r>
-        <w:rPr>
-          <w:lang w:val="sv-SE"/>
-        </w:rPr>
-        <w:t xml:space="preserve"> CI-miljö</w:t>
-      </w:r>
-      <w:r>
-        <w:rPr>
-          <w:lang w:val="sv-SE"/>
-        </w:rPr>
-        <w:t xml:space="preserve">n har behörighet att få åtkomst till </w:t>
-      </w:r>
-      <w:proofErr w:type="gramStart"/>
-      <w:r>
-        <w:rPr>
-          <w:lang w:val="sv-SE"/>
-        </w:rPr>
-        <w:t>dessa externa systemen</w:t>
-      </w:r>
-      <w:proofErr w:type="gramEnd"/>
-      <w:r>
-        <w:rPr>
-          <w:lang w:val="sv-SE"/>
-        </w:rPr>
-        <w:t xml:space="preserve">. </w:t>
-      </w:r>
-    </w:p>
-    <w:p>
-      <w:pPr>
-        <w:rPr>
-          <w:lang w:val="sv-SE"/>
-        </w:rPr>
-      </w:pPr>
-    </w:p>
-    <w:p>
-      <w:pPr>
-        <w:rPr>
-          <w:lang w:val="sv-SE"/>
-        </w:rPr>
-      </w:pPr>
-    </w:p>
-    <w:p>
-      <w:pPr>
-        <w:rPr>
-          <w:b/>
-          <w:bCs/>
-        </w:rPr>
-      </w:pPr>
-      <w:r>
-        <w:rPr>
-          <w:b/>
-          <w:bCs/>
-        </w:rPr>
-        <w:t xml:space="preserve">Selenium för </w:t>
-      </w:r>
-      <w:r>
-        <w:rPr>
-          <w:b/>
-          <w:bCs/>
-        </w:rPr>
-        <w:t>UI</w:t>
-      </w:r>
-      <w:r>
-        <w:rPr>
-          <w:b/>
-          <w:bCs/>
-        </w:rPr>
-        <w:t xml:space="preserve"> &amp; E2E </w:t>
-      </w:r>
-      <w:r>
-        <w:rPr>
-          <w:b/>
-          <w:bCs/>
-        </w:rPr>
-        <w:t>tester</w:t>
-      </w:r>
-    </w:p>
-    <w:p>
-      <w:pPr>
-        <w:rPr>
-          <w:lang w:val="sv-SE"/>
-        </w:rPr>
-      </w:pPr>
+        <w:t xml:space="preserve">Fördelar med </w:t>
+      </w:r>
       <w:proofErr w:type="spellStart"/>
       <w:r>
-        <w:rPr>
-          <w:lang w:val="sv-SE"/>
-        </w:rPr>
-        <w:lastRenderedPageBreak/>
-        <w:t>Selenium</w:t>
-      </w:r>
-      <w:proofErr w:type="spellEnd"/>
-      <w:r>
-        <w:rPr>
-          <w:lang w:val="sv-SE"/>
-        </w:rPr>
-        <w:t xml:space="preserve"> </w:t>
-      </w:r>
-      <w:proofErr w:type="spellStart"/>
-      <w:r>
-        <w:rPr>
-          <w:lang w:val="sv-SE"/>
-        </w:rPr>
-        <w:t>WebDriver</w:t>
-      </w:r>
-      <w:proofErr w:type="spellEnd"/>
-      <w:r>
-        <w:rPr>
-          <w:lang w:val="sv-SE"/>
-        </w:rPr>
-        <w:t xml:space="preserve"> används i projektet för att testa inloggningsflödet via webbläsare. Dessa tester fokuserar på att verifiera systemet </w:t>
-      </w:r>
-      <w:r>
-        <w:rPr>
-          <w:lang w:val="sv-SE"/>
-        </w:rPr>
-        <w:t>från</w:t>
-      </w:r>
-      <w:r>
-        <w:rPr>
-          <w:lang w:val="sv-SE"/>
-        </w:rPr>
-        <w:t xml:space="preserve"> användarens perspektiv.</w:t>
-      </w:r>
-      <w:r>
-        <w:rPr>
-          <w:lang w:val="sv-SE"/>
-        </w:rPr>
-        <w:t xml:space="preserve"> Manuellt knapp </w:t>
-      </w:r>
-      <w:proofErr w:type="spellStart"/>
-      <w:r>
-        <w:rPr>
-          <w:lang w:val="sv-SE"/>
-        </w:rPr>
-        <w:t>antryckning</w:t>
-      </w:r>
-      <w:proofErr w:type="spellEnd"/>
-      <w:r>
-        <w:rPr>
-          <w:lang w:val="sv-SE"/>
-        </w:rPr>
-        <w:t xml:space="preserve"> behövs inte för att detta kan simulera med hjälp av </w:t>
-      </w:r>
-      <w:proofErr w:type="spellStart"/>
-      <w:r>
-        <w:rPr>
-          <w:lang w:val="sv-SE"/>
-        </w:rPr>
-        <w:t>Selenium</w:t>
-      </w:r>
-      <w:proofErr w:type="spellEnd"/>
-      <w:r>
-        <w:rPr>
-          <w:lang w:val="sv-SE"/>
-        </w:rPr>
-        <w:t xml:space="preserve">. </w:t>
-      </w:r>
-    </w:p>
-    <w:p>
-      <w:pPr>
-        <w:rPr>
-          <w:lang w:val="sv-SE"/>
-        </w:rPr>
-      </w:pPr>
-      <w:r>
-        <w:rPr>
-          <w:lang w:val="sv-SE"/>
-        </w:rPr>
-        <w:t xml:space="preserve">Exempel från mitt projekt: </w:t>
-      </w:r>
-    </w:p>
-    <w:p>
-      <w:r>
-        <w:t xml:space="preserve">def </w:t>
-      </w:r>
-      <w:proofErr w:type="spellStart"/>
-      <w:r>
-        <w:t>test_login_success</w:t>
-      </w:r>
-      <w:proofErr w:type="spellEnd"/>
-      <w:r>
-        <w:t>(driver):</w:t>
-      </w:r>
-    </w:p>
-    <w:p>
-      <w:r>
-        <w:t xml:space="preserve">    </w:t>
-      </w:r>
-      <w:r>
-        <w:t>login (</w:t>
-      </w:r>
-      <w:r>
-        <w:t>driver, "</w:t>
-      </w:r>
-      <w:proofErr w:type="spellStart"/>
-      <w:r>
-        <w:t>standard_user</w:t>
-      </w:r>
-      <w:proofErr w:type="spellEnd"/>
-      <w:r>
-        <w:t>", "</w:t>
-      </w:r>
-      <w:proofErr w:type="spellStart"/>
-      <w:r>
-        <w:t>secret_sauce</w:t>
-      </w:r>
-      <w:proofErr w:type="spellEnd"/>
-      <w:r>
-        <w:t>")</w:t>
-      </w:r>
-    </w:p>
-    <w:p>
-      <w:r>
-        <w:t xml:space="preserve">    assert "inventory" in </w:t>
-      </w:r>
-      <w:proofErr w:type="spellStart"/>
-      <w:proofErr w:type="gramStart"/>
-      <w:r>
-        <w:t>driver.current</w:t>
-      </w:r>
-      <w:proofErr w:type="gramEnd"/>
-      <w:r>
-        <w:t>_url</w:t>
-      </w:r>
-      <w:proofErr w:type="spellEnd"/>
-    </w:p>
-    <w:p>
-      <w:pPr>
         <w:rPr>
           <w:b/>
           <w:bCs/>
           <w:i/>
           <w:iCs/>
-        </w:rPr>
-      </w:pPr>
-      <w:proofErr w:type="spellStart"/>
+          <w:lang w:val="sv-SE"/>
+        </w:rPr>
+        <w:t>Selenium</w:t>
+      </w:r>
+      <w:proofErr w:type="spellEnd"/>
       <w:r>
         <w:rPr>
           <w:b/>
           <w:bCs/>
           <w:i/>
           <w:iCs/>
-        </w:rPr>
-        <w:t>Fördelar</w:t>
-      </w:r>
-      <w:proofErr w:type="spellEnd"/>
+          <w:lang w:val="sv-SE"/>
+        </w:rPr>
+        <w:t xml:space="preserve"> + </w:t>
+      </w:r>
+      <w:proofErr w:type="spellStart"/>
       <w:r>
         <w:rPr>
           <w:b/>
           <w:bCs/>
           <w:i/>
           <w:iCs/>
-        </w:rPr>
-        <w:t xml:space="preserve"> med Selenium</w:t>
-      </w:r>
+          <w:lang w:val="sv-SE"/>
+        </w:rPr>
+        <w:t>Pytest</w:t>
+      </w:r>
+      <w:proofErr w:type="spellEnd"/>
     </w:p>
     <w:p>
       <w:pPr>
-        <w:rPr>
-          <w:lang w:val="sv-SE"/>
-        </w:rPr>
-      </w:pPr>
+        <w:pStyle w:val="ListParagraph"/>
+        <w:numPr>
+          <w:ilvl w:val="1"/>
+          <w:numId w:val="11"/>
+        </w:numPr>
+        <w:rPr>
+          <w:lang w:val="sv-SE"/>
+        </w:rPr>
+      </w:pPr>
+      <w:r>
+        <w:rPr>
+          <w:lang w:val="sv-SE"/>
+        </w:rPr>
+        <w:t xml:space="preserve">Mycket moget </w:t>
+      </w:r>
       <w:proofErr w:type="spellStart"/>
       <w:r>
         <w:rPr>
           <w:lang w:val="sv-SE"/>
         </w:rPr>
+        <w:t>community</w:t>
+      </w:r>
+      <w:proofErr w:type="spellEnd"/>
+      <w:r>
+        <w:rPr>
+          <w:lang w:val="sv-SE"/>
+        </w:rPr>
+        <w:t xml:space="preserve">: </w:t>
+      </w:r>
+      <w:proofErr w:type="spellStart"/>
+      <w:r>
+        <w:rPr>
+          <w:lang w:val="sv-SE"/>
+        </w:rPr>
         <w:t>Selenium</w:t>
       </w:r>
       <w:proofErr w:type="spellEnd"/>
@@ -2727,44 +3106,132 @@
         <w:rPr>
           <w:lang w:val="sv-SE"/>
         </w:rPr>
-        <w:t xml:space="preserve"> testar hela användarflödet från start till slut och säkerställer att kritiska funktioner</w:t>
-      </w:r>
-      <w:r>
-        <w:rPr>
-          <w:lang w:val="sv-SE"/>
-        </w:rPr>
-        <w:t xml:space="preserve"> </w:t>
-      </w:r>
-      <w:r>
-        <w:rPr>
-          <w:lang w:val="sv-SE"/>
-        </w:rPr>
-        <w:t>som inloggning</w:t>
-      </w:r>
-      <w:r>
-        <w:rPr>
-          <w:lang w:val="sv-SE"/>
-        </w:rPr>
-        <w:t xml:space="preserve"> </w:t>
-      </w:r>
-      <w:r>
-        <w:rPr>
-          <w:lang w:val="sv-SE"/>
-        </w:rPr>
-        <w:t>fungerar som de ska. Det kan också upptäcka problem som inte syns i API- eller enhetstester</w:t>
-      </w:r>
-      <w:r>
-        <w:rPr>
-          <w:lang w:val="sv-SE"/>
-        </w:rPr>
-        <w:t xml:space="preserve"> eller CI</w:t>
-      </w:r>
-      <w:r>
-        <w:rPr>
-          <w:lang w:val="sv-SE"/>
-        </w:rPr>
-        <w:t>.</w:t>
-      </w:r>
+        <w:t xml:space="preserve"> har använ</w:t>
+      </w:r>
+      <w:r>
+        <w:rPr>
+          <w:lang w:val="sv-SE"/>
+        </w:rPr>
+        <w:t xml:space="preserve">ts i många år och är välbeprövat </w:t>
+      </w:r>
+      <w:r>
+        <w:rPr>
+          <w:lang w:val="sv-SE"/>
+        </w:rPr>
+        <w:t xml:space="preserve">i produktion. </w:t>
+      </w:r>
+    </w:p>
+    <w:p>
+      <w:pPr>
+        <w:pStyle w:val="ListParagraph"/>
+        <w:numPr>
+          <w:ilvl w:val="1"/>
+          <w:numId w:val="11"/>
+        </w:numPr>
+        <w:rPr>
+          <w:lang w:val="sv-SE"/>
+        </w:rPr>
+      </w:pPr>
+      <w:r>
+        <w:rPr>
+          <w:lang w:val="sv-SE"/>
+        </w:rPr>
+        <w:t xml:space="preserve">Stöd för all större webbläsare: Inklusive riktig Safari, vilket fortfarande är ett krav i vissa projekt. </w:t>
+      </w:r>
+    </w:p>
+    <w:p>
+      <w:pPr>
+        <w:pStyle w:val="ListParagraph"/>
+        <w:numPr>
+          <w:ilvl w:val="1"/>
+          <w:numId w:val="11"/>
+        </w:numPr>
+        <w:rPr>
+          <w:lang w:val="sv-SE"/>
+        </w:rPr>
+      </w:pPr>
+      <w:r>
+        <w:rPr>
+          <w:lang w:val="sv-SE"/>
+        </w:rPr>
+        <w:t xml:space="preserve">Stor mängd dokumentation och exempel: Det är lätt att hitta lösningar på vanliga problem. </w:t>
+      </w:r>
+    </w:p>
+    <w:p>
+      <w:pPr>
+        <w:pStyle w:val="ListParagraph"/>
+        <w:numPr>
+          <w:ilvl w:val="1"/>
+          <w:numId w:val="11"/>
+        </w:numPr>
+        <w:rPr>
+          <w:lang w:val="sv-SE"/>
+        </w:rPr>
+      </w:pPr>
+      <w:r>
+        <w:rPr>
+          <w:lang w:val="sv-SE"/>
+        </w:rPr>
+        <w:t>Flexibelt ramverk: Går att anpassa till många typer ab teststrategier och miljöer.</w:t>
+      </w:r>
+    </w:p>
+    <w:p>
+      <w:pPr>
+        <w:pStyle w:val="ListParagraph"/>
+        <w:numPr>
+          <w:ilvl w:val="1"/>
+          <w:numId w:val="11"/>
+        </w:numPr>
+        <w:rPr>
+          <w:lang w:val="sv-SE"/>
+        </w:rPr>
+      </w:pPr>
+      <w:r>
+        <w:rPr>
+          <w:lang w:val="sv-SE"/>
+        </w:rPr>
+        <w:t xml:space="preserve">Passar bra för långlivade testsviter: I organisationer där </w:t>
+      </w:r>
+      <w:proofErr w:type="spellStart"/>
+      <w:r>
+        <w:rPr>
+          <w:lang w:val="sv-SE"/>
+        </w:rPr>
+        <w:t>Selenium</w:t>
+      </w:r>
+      <w:proofErr w:type="spellEnd"/>
+      <w:r>
+        <w:rPr>
+          <w:lang w:val="sv-SE"/>
+        </w:rPr>
+        <w:t xml:space="preserve"> redan är etablerat är det att fortsätta med </w:t>
+      </w:r>
+      <w:proofErr w:type="spellStart"/>
+      <w:r>
+        <w:rPr>
+          <w:lang w:val="sv-SE"/>
+        </w:rPr>
+        <w:t>Selenium</w:t>
+      </w:r>
+      <w:proofErr w:type="spellEnd"/>
+      <w:r>
+        <w:rPr>
+          <w:lang w:val="sv-SE"/>
+        </w:rPr>
+        <w:t xml:space="preserve">. </w:t>
+      </w:r>
+    </w:p>
+    <w:p>
+      <w:pPr>
+        <w:pStyle w:val="ListParagraph"/>
+        <w:numPr>
+          <w:ilvl w:val="1"/>
+          <w:numId w:val="11"/>
+        </w:numPr>
+        <w:rPr>
+          <w:lang w:val="sv-SE"/>
+        </w:rPr>
+      </w:pPr>
     </w:p>
     <w:p>
       <w:pPr>
@@ -2784,9 +3251,9 @@
           <w:iCs/>
           <w:lang w:val="sv-SE"/>
         </w:rPr>
-        <w:t xml:space="preserve">Nackdelar med </w:t>
-      </w:r>
-      <w:proofErr w:type="spellStart"/>
+        <w:lastRenderedPageBreak/>
+        <w:t>Nack</w:t>
+      </w:r>
       <w:r>
         <w:rPr>
           <w:b/>
@@ -2795,18 +3262,196 @@
           <w:iCs/>
           <w:lang w:val="sv-SE"/>
         </w:rPr>
+        <w:t xml:space="preserve">delar med </w:t>
+      </w:r>
+      <w:proofErr w:type="spellStart"/>
+      <w:r>
+        <w:rPr>
+          <w:b/>
+          <w:bCs/>
+          <w:i/>
+          <w:iCs/>
+          <w:lang w:val="sv-SE"/>
+        </w:rPr>
         <w:t>Selenium</w:t>
+      </w:r>
+      <w:proofErr w:type="spellEnd"/>
+      <w:r>
+        <w:rPr>
+          <w:b/>
+          <w:bCs/>
+          <w:i/>
+          <w:iCs/>
+          <w:lang w:val="sv-SE"/>
+        </w:rPr>
+        <w:t xml:space="preserve"> + </w:t>
+      </w:r>
+      <w:proofErr w:type="spellStart"/>
+      <w:r>
+        <w:rPr>
+          <w:b/>
+          <w:bCs/>
+          <w:i/>
+          <w:iCs/>
+          <w:lang w:val="sv-SE"/>
+        </w:rPr>
+        <w:t>Pytest</w:t>
       </w:r>
       <w:proofErr w:type="spellEnd"/>
     </w:p>
     <w:p>
       <w:pPr>
+        <w:pStyle w:val="ListParagraph"/>
+        <w:numPr>
+          <w:ilvl w:val="1"/>
+          <w:numId w:val="11"/>
+        </w:numPr>
+        <w:rPr>
+          <w:lang w:val="sv-SE"/>
+        </w:rPr>
+      </w:pPr>
+      <w:r>
+        <w:rPr>
+          <w:lang w:val="sv-SE"/>
+        </w:rPr>
+        <w:t>Kräver mer konfiguration</w:t>
+      </w:r>
+      <w:r>
+        <w:rPr>
+          <w:lang w:val="sv-SE"/>
+        </w:rPr>
+        <w:t xml:space="preserve">: </w:t>
+      </w:r>
+      <w:r>
+        <w:rPr>
+          <w:lang w:val="sv-SE"/>
+        </w:rPr>
+        <w:t>Drivrutiner, versioner och miljöer måste hanteras aktivt.</w:t>
+      </w:r>
+    </w:p>
+    <w:p>
+      <w:pPr>
+        <w:pStyle w:val="ListParagraph"/>
+        <w:numPr>
+          <w:ilvl w:val="1"/>
+          <w:numId w:val="11"/>
+        </w:numPr>
+        <w:rPr>
+          <w:lang w:val="sv-SE"/>
+        </w:rPr>
+      </w:pPr>
+      <w:r>
+        <w:rPr>
+          <w:lang w:val="sv-SE"/>
+        </w:rPr>
+        <w:t xml:space="preserve">Manuell vänte logik: </w:t>
+      </w:r>
+      <w:r>
+        <w:rPr>
+          <w:lang w:val="sv-SE"/>
+        </w:rPr>
+        <w:t>Testaren måste själv hantera timing och synkronisering</w:t>
+      </w:r>
+      <w:r>
+        <w:rPr>
+          <w:lang w:val="sv-SE"/>
+        </w:rPr>
+        <w:t>.</w:t>
+      </w:r>
+    </w:p>
+    <w:p>
+      <w:pPr>
+        <w:pStyle w:val="ListParagraph"/>
+        <w:numPr>
+          <w:ilvl w:val="1"/>
+          <w:numId w:val="11"/>
+        </w:numPr>
+        <w:rPr>
+          <w:lang w:val="sv-SE"/>
+        </w:rPr>
+      </w:pPr>
+      <w:r>
+        <w:rPr>
+          <w:lang w:val="sv-SE"/>
+        </w:rPr>
+        <w:t xml:space="preserve">Mer tid går till stabilisering: </w:t>
+      </w:r>
+      <w:r>
+        <w:rPr>
+          <w:lang w:val="sv-SE"/>
+        </w:rPr>
+        <w:t xml:space="preserve">UI-förändringar och </w:t>
+      </w:r>
+      <w:r>
+        <w:rPr>
+          <w:lang w:val="sv-SE"/>
+        </w:rPr>
+        <w:t>timing problem</w:t>
+      </w:r>
+      <w:r>
+        <w:rPr>
+          <w:lang w:val="sv-SE"/>
+        </w:rPr>
+        <w:t xml:space="preserve"> orsakar ofta instabila tester.</w:t>
+      </w:r>
+    </w:p>
+    <w:p>
+      <w:pPr>
+        <w:pStyle w:val="ListParagraph"/>
+        <w:numPr>
+          <w:ilvl w:val="1"/>
+          <w:numId w:val="11"/>
+        </w:numPr>
+        <w:rPr>
+          <w:lang w:val="sv-SE"/>
+        </w:rPr>
+      </w:pPr>
+      <w:r>
+        <w:rPr>
+          <w:lang w:val="sv-SE"/>
+        </w:rPr>
+        <w:t xml:space="preserve">Tester blir lätt instabila i CI-miljöer: </w:t>
+      </w:r>
+      <w:r>
+        <w:rPr>
+          <w:lang w:val="sv-SE"/>
+        </w:rPr>
+        <w:t>Tester blir längre och mer tekniskt detaljerade.</w:t>
+      </w:r>
+    </w:p>
+    <w:p>
+      <w:pPr>
+        <w:rPr>
+          <w:lang w:val="sv-SE"/>
+        </w:rPr>
+      </w:pPr>
+    </w:p>
+    <w:p>
+      <w:pPr>
         <w:rPr>
           <w:b/>
           <w:bCs/>
           <w:lang w:val="sv-SE"/>
         </w:rPr>
       </w:pPr>
+      <w:proofErr w:type="spellStart"/>
+      <w:r>
+        <w:rPr>
+          <w:b/>
+          <w:bCs/>
+          <w:lang w:val="sv-SE"/>
+        </w:rPr>
+        <w:t>Pytest</w:t>
+      </w:r>
+      <w:proofErr w:type="spellEnd"/>
+      <w:r>
+        <w:rPr>
+          <w:b/>
+          <w:bCs/>
+          <w:lang w:val="sv-SE"/>
+        </w:rPr>
+        <w:t xml:space="preserve">-grunden i testautomatiseringen </w:t>
+      </w:r>
     </w:p>
     <w:p>
       <w:pPr>
@@ -2814,44 +3459,607 @@
           <w:lang w:val="sv-SE"/>
         </w:rPr>
       </w:pPr>
+      <w:r>
+        <w:rPr>
+          <w:lang w:val="sv-SE"/>
+        </w:rPr>
+        <w:t xml:space="preserve">Pytest används som det grundläggande testramverk i projektet. </w:t>
+      </w:r>
+      <w:r>
+        <w:rPr>
+          <w:lang w:val="sv-SE"/>
+        </w:rPr>
+        <w:t xml:space="preserve">Det hanterar testkörning, </w:t>
+      </w:r>
+      <w:proofErr w:type="spellStart"/>
+      <w:r>
+        <w:rPr>
+          <w:lang w:val="sv-SE"/>
+        </w:rPr>
+        <w:t>assertioner</w:t>
+      </w:r>
+      <w:proofErr w:type="spellEnd"/>
+      <w:r>
+        <w:rPr>
+          <w:lang w:val="sv-SE"/>
+        </w:rPr>
+        <w:t xml:space="preserve"> och struktur, vilket gör det enkelt att skriva tydliga och fokuserade tester. </w:t>
+      </w:r>
     </w:p>
     <w:p>
-      <w:pPr>
-        <w:rPr>
-          <w:lang w:val="sv-SE"/>
-        </w:rPr>
-      </w:pPr>
+      <w:proofErr w:type="spellStart"/>
+      <w:r>
+        <w:t>Exempel</w:t>
+      </w:r>
+      <w:proofErr w:type="spellEnd"/>
+      <w:r>
+        <w:t xml:space="preserve"> </w:t>
+      </w:r>
+      <w:proofErr w:type="spellStart"/>
+      <w:r>
+        <w:t>från</w:t>
+      </w:r>
+      <w:proofErr w:type="spellEnd"/>
+      <w:r>
+        <w:t xml:space="preserve"> </w:t>
+      </w:r>
+      <w:proofErr w:type="spellStart"/>
+      <w:r>
+        <w:t>projektet</w:t>
+      </w:r>
+      <w:proofErr w:type="spellEnd"/>
+      <w:r>
+        <w:t xml:space="preserve">: </w:t>
+      </w:r>
     </w:p>
     <w:p>
-      <w:pPr>
-        <w:rPr>
-          <w:lang w:val="sv-SE"/>
-        </w:rPr>
-      </w:pPr>
+      <w:r>
+        <w:t>def test_get_products_returns_200():</w:t>
+      </w:r>
     </w:p>
     <w:p>
-      <w:pPr>
-        <w:rPr>
-          <w:lang w:val="sv-SE"/>
-        </w:rPr>
-      </w:pPr>
+      <w:r>
+        <w:t xml:space="preserve">    response = requests. </w:t>
+      </w:r>
+      <w:r>
+        <w:t>g</w:t>
+      </w:r>
+      <w:r>
+        <w:t>et(f"{BASE_URL}/products")</w:t>
+      </w:r>
     </w:p>
     <w:p>
       <w:pPr>
-        <w:pStyle w:val="Heading2"/>
-        <w:rPr>
-          <w:lang w:val="sv-SE"/>
-        </w:rPr>
-      </w:pPr>
-      <w:r>
-        <w:rPr>
-          <w:lang w:val="sv-SE"/>
-        </w:rPr>
-        <w:t>Hur teststrategi påverkar byggtid</w:t>
+        <w:rPr>
+          <w:lang w:val="sv-SE"/>
+        </w:rPr>
+      </w:pPr>
+      <w:r>
+        <w:t xml:space="preserve">    </w:t>
+      </w:r>
+      <w:proofErr w:type="spellStart"/>
+      <w:r>
+        <w:rPr>
+          <w:lang w:val="sv-SE"/>
+        </w:rPr>
+        <w:t>assert</w:t>
+      </w:r>
+      <w:proofErr w:type="spellEnd"/>
+      <w:r>
+        <w:rPr>
+          <w:lang w:val="sv-SE"/>
+        </w:rPr>
+        <w:t xml:space="preserve"> </w:t>
+      </w:r>
+      <w:proofErr w:type="spellStart"/>
+      <w:proofErr w:type="gramStart"/>
+      <w:r>
+        <w:rPr>
+          <w:lang w:val="sv-SE"/>
+        </w:rPr>
+        <w:t>response.status</w:t>
+      </w:r>
+      <w:proofErr w:type="gramEnd"/>
+      <w:r>
+        <w:rPr>
+          <w:lang w:val="sv-SE"/>
+        </w:rPr>
+        <w:t>_code</w:t>
+      </w:r>
+      <w:proofErr w:type="spellEnd"/>
+      <w:r>
+        <w:rPr>
+          <w:lang w:val="sv-SE"/>
+        </w:rPr>
+        <w:t xml:space="preserve"> == 200</w:t>
       </w:r>
     </w:p>
     <w:p>
       <w:pPr>
+        <w:rPr>
+          <w:lang w:val="sv-SE"/>
+        </w:rPr>
+      </w:pPr>
+    </w:p>
+    <w:p>
+      <w:pPr>
+        <w:rPr>
+          <w:b/>
+          <w:bCs/>
+          <w:i/>
+          <w:iCs/>
+          <w:lang w:val="sv-SE"/>
+        </w:rPr>
+      </w:pPr>
+      <w:r>
+        <w:rPr>
+          <w:b/>
+          <w:bCs/>
+          <w:i/>
+          <w:iCs/>
+          <w:lang w:val="sv-SE"/>
+        </w:rPr>
+        <w:t>Fördelar med Pytest</w:t>
+      </w:r>
+    </w:p>
+    <w:p>
+      <w:pPr>
+        <w:rPr>
+          <w:lang w:val="sv-SE"/>
+        </w:rPr>
+      </w:pPr>
+      <w:r>
+        <w:rPr>
+          <w:lang w:val="sv-SE"/>
+        </w:rPr>
+        <w:t>Testfallen är</w:t>
+      </w:r>
+      <w:r>
+        <w:rPr>
+          <w:lang w:val="sv-SE"/>
+        </w:rPr>
+        <w:t xml:space="preserve"> korta och lätta att förstå, vilket gör dem enkla att underhålla över tid. De körs snabbt i CI och ger direkt feedback vid varje push. När ett test fallerar är det också lätt att se exakt vad som gått fel. Dessutom är testsviten enkel att bygga vidare på när nya funktioner tillkommer. </w:t>
+      </w:r>
+    </w:p>
+    <w:p>
+      <w:pPr>
+        <w:rPr>
+          <w:lang w:val="sv-SE"/>
+        </w:rPr>
+      </w:pPr>
+    </w:p>
+    <w:p>
+      <w:pPr>
+        <w:rPr>
+          <w:b/>
+          <w:bCs/>
+          <w:i/>
+          <w:iCs/>
+          <w:lang w:val="sv-SE"/>
+        </w:rPr>
+      </w:pPr>
+      <w:r>
+        <w:rPr>
+          <w:b/>
+          <w:bCs/>
+          <w:i/>
+          <w:iCs/>
+          <w:lang w:val="sv-SE"/>
+        </w:rPr>
+        <w:t>Nackdelar med Pytest</w:t>
+      </w:r>
+    </w:p>
+    <w:p>
+      <w:pPr>
+        <w:rPr>
+          <w:lang w:val="sv-SE"/>
+        </w:rPr>
+      </w:pPr>
+      <w:r>
+        <w:rPr>
+          <w:lang w:val="sv-SE"/>
+        </w:rPr>
+        <w:t>Pytest är begränsat till Python-projekt, och om testsviten växer utan tydlig struktur kan den bli svår att överblicka</w:t>
+      </w:r>
+      <w:r>
+        <w:rPr>
+          <w:lang w:val="sv-SE"/>
+        </w:rPr>
+        <w:t xml:space="preserve"> men i ett litet projekt som mitt Del-2&amp;3 projekt är lätt att hantera. </w:t>
+      </w:r>
+    </w:p>
+    <w:p>
+      <w:pPr>
+        <w:rPr>
+          <w:lang w:val="sv-SE"/>
+        </w:rPr>
+      </w:pPr>
+    </w:p>
+    <w:p>
+      <w:pPr>
+        <w:rPr>
+          <w:lang w:val="sv-SE"/>
+        </w:rPr>
+      </w:pPr>
+    </w:p>
+    <w:p>
+      <w:pPr>
+        <w:rPr>
+          <w:lang w:val="sv-SE"/>
+        </w:rPr>
+      </w:pPr>
+    </w:p>
+    <w:p>
+      <w:pPr>
+        <w:rPr>
+          <w:lang w:val="sv-SE"/>
+        </w:rPr>
+      </w:pPr>
+    </w:p>
+    <w:p>
+      <w:pPr>
+        <w:rPr>
+          <w:b/>
+          <w:bCs/>
+          <w:lang w:val="sv-SE"/>
+        </w:rPr>
+      </w:pPr>
+      <w:proofErr w:type="spellStart"/>
+      <w:r>
+        <w:rPr>
+          <w:b/>
+          <w:bCs/>
+          <w:lang w:val="sv-SE"/>
+        </w:rPr>
+        <w:lastRenderedPageBreak/>
+        <w:t>Unittest</w:t>
+      </w:r>
+      <w:proofErr w:type="spellEnd"/>
+    </w:p>
+    <w:p>
+      <w:pPr>
+        <w:rPr>
+          <w:lang w:val="sv-SE"/>
+        </w:rPr>
+      </w:pPr>
+      <w:proofErr w:type="spellStart"/>
+      <w:r>
+        <w:rPr>
+          <w:lang w:val="sv-SE"/>
+        </w:rPr>
+        <w:t>Unittest</w:t>
+      </w:r>
+      <w:proofErr w:type="spellEnd"/>
+      <w:r>
+        <w:rPr>
+          <w:lang w:val="sv-SE"/>
+        </w:rPr>
+        <w:t xml:space="preserve"> är inspirerat av </w:t>
+      </w:r>
+      <w:proofErr w:type="spellStart"/>
+      <w:r>
+        <w:rPr>
+          <w:lang w:val="sv-SE"/>
+        </w:rPr>
+        <w:t>JUnit</w:t>
+      </w:r>
+      <w:proofErr w:type="spellEnd"/>
+      <w:r>
+        <w:rPr>
+          <w:lang w:val="sv-SE"/>
+        </w:rPr>
+        <w:t xml:space="preserve"> och bygger på klassbaserade tester med tydlig livscykel </w:t>
+      </w:r>
+      <w:r>
+        <w:rPr>
+          <w:lang w:val="sv-SE"/>
+        </w:rPr>
+        <w:t>(</w:t>
+      </w:r>
+      <w:proofErr w:type="spellStart"/>
+      <w:r>
+        <w:rPr>
+          <w:lang w:val="sv-SE"/>
+        </w:rPr>
+        <w:t>setUp</w:t>
+      </w:r>
+      <w:proofErr w:type="spellEnd"/>
+      <w:r>
+        <w:rPr>
+          <w:lang w:val="sv-SE"/>
+        </w:rPr>
+        <w:t xml:space="preserve">, </w:t>
+      </w:r>
+      <w:proofErr w:type="spellStart"/>
+      <w:r>
+        <w:rPr>
+          <w:lang w:val="sv-SE"/>
+        </w:rPr>
+        <w:t>tearDown</w:t>
+      </w:r>
+      <w:proofErr w:type="spellEnd"/>
+      <w:r>
+        <w:rPr>
+          <w:lang w:val="sv-SE"/>
+        </w:rPr>
+        <w:t>)</w:t>
+      </w:r>
+      <w:r>
+        <w:rPr>
+          <w:lang w:val="sv-SE"/>
+        </w:rPr>
+        <w:t>.</w:t>
+      </w:r>
+      <w:r>
+        <w:rPr>
+          <w:lang w:val="sv-SE"/>
+        </w:rPr>
+        <w:t xml:space="preserve"> </w:t>
+      </w:r>
+      <w:r>
+        <w:rPr>
+          <w:lang w:val="sv-SE"/>
+        </w:rPr>
+        <w:t>Strukturen är strikt och förutsägbar</w:t>
+      </w:r>
+    </w:p>
+    <w:p>
+      <w:pPr>
+        <w:rPr>
+          <w:b/>
+          <w:bCs/>
+          <w:i/>
+          <w:iCs/>
+          <w:lang w:val="sv-SE"/>
+        </w:rPr>
+      </w:pPr>
+      <w:r>
+        <w:rPr>
+          <w:b/>
+          <w:bCs/>
+          <w:i/>
+          <w:iCs/>
+          <w:lang w:val="sv-SE"/>
+        </w:rPr>
+        <w:t xml:space="preserve">Fördelar med </w:t>
+      </w:r>
+      <w:proofErr w:type="spellStart"/>
+      <w:r>
+        <w:rPr>
+          <w:b/>
+          <w:bCs/>
+          <w:i/>
+          <w:iCs/>
+          <w:lang w:val="sv-SE"/>
+        </w:rPr>
+        <w:t>Unit</w:t>
+      </w:r>
+      <w:r>
+        <w:rPr>
+          <w:b/>
+          <w:bCs/>
+          <w:i/>
+          <w:iCs/>
+          <w:lang w:val="sv-SE"/>
+        </w:rPr>
+        <w:t>test</w:t>
+      </w:r>
+      <w:proofErr w:type="spellEnd"/>
+    </w:p>
+    <w:p>
+      <w:pPr>
+        <w:pStyle w:val="ListParagraph"/>
+        <w:numPr>
+          <w:ilvl w:val="1"/>
+          <w:numId w:val="11"/>
+        </w:numPr>
+        <w:rPr>
+          <w:lang w:val="sv-SE"/>
+        </w:rPr>
+      </w:pPr>
+      <w:r>
+        <w:rPr>
+          <w:lang w:val="sv-SE"/>
+        </w:rPr>
+        <w:t xml:space="preserve">Ingår i </w:t>
+      </w:r>
+      <w:proofErr w:type="spellStart"/>
+      <w:r>
+        <w:rPr>
+          <w:lang w:val="sv-SE"/>
+        </w:rPr>
+        <w:t>Python</w:t>
+      </w:r>
+      <w:proofErr w:type="spellEnd"/>
+      <w:r>
+        <w:rPr>
+          <w:lang w:val="sv-SE"/>
+        </w:rPr>
+        <w:t xml:space="preserve"> standardbibliotek </w:t>
+      </w:r>
+    </w:p>
+    <w:p>
+      <w:pPr>
+        <w:pStyle w:val="ListParagraph"/>
+        <w:numPr>
+          <w:ilvl w:val="1"/>
+          <w:numId w:val="11"/>
+        </w:numPr>
+        <w:rPr>
+          <w:lang w:val="sv-SE"/>
+        </w:rPr>
+      </w:pPr>
+      <w:r>
+        <w:rPr>
+          <w:lang w:val="sv-SE"/>
+        </w:rPr>
+        <w:t>Passar bra i mycket kontrollerade miljöer</w:t>
+      </w:r>
+    </w:p>
+    <w:p>
+      <w:pPr>
+        <w:pStyle w:val="ListParagraph"/>
+        <w:numPr>
+          <w:ilvl w:val="1"/>
+          <w:numId w:val="11"/>
+        </w:numPr>
+        <w:rPr>
+          <w:lang w:val="sv-SE"/>
+        </w:rPr>
+      </w:pPr>
+      <w:r>
+        <w:rPr>
+          <w:lang w:val="sv-SE"/>
+        </w:rPr>
+        <w:t>Lätt att förstå för Java/</w:t>
+      </w:r>
+      <w:proofErr w:type="spellStart"/>
+      <w:r>
+        <w:rPr>
+          <w:lang w:val="sv-SE"/>
+        </w:rPr>
+        <w:t>Junit</w:t>
+      </w:r>
+      <w:proofErr w:type="spellEnd"/>
+      <w:r>
+        <w:rPr>
+          <w:lang w:val="sv-SE"/>
+        </w:rPr>
+        <w:t>-erfarna team</w:t>
+      </w:r>
+    </w:p>
+    <w:p>
+      <w:pPr>
+        <w:rPr>
+          <w:b/>
+          <w:bCs/>
+          <w:i/>
+          <w:iCs/>
+          <w:lang w:val="sv-SE"/>
+        </w:rPr>
+      </w:pPr>
+      <w:r>
+        <w:rPr>
+          <w:b/>
+          <w:bCs/>
+          <w:i/>
+          <w:iCs/>
+          <w:lang w:val="sv-SE"/>
+        </w:rPr>
+        <w:t xml:space="preserve">Nackdelar med </w:t>
+      </w:r>
+      <w:proofErr w:type="spellStart"/>
+      <w:r>
+        <w:rPr>
+          <w:b/>
+          <w:bCs/>
+          <w:i/>
+          <w:iCs/>
+          <w:lang w:val="sv-SE"/>
+        </w:rPr>
+        <w:t>Unit</w:t>
+      </w:r>
+      <w:r>
+        <w:rPr>
+          <w:b/>
+          <w:bCs/>
+          <w:i/>
+          <w:iCs/>
+          <w:lang w:val="sv-SE"/>
+        </w:rPr>
+        <w:t>test</w:t>
+      </w:r>
+      <w:proofErr w:type="spellEnd"/>
+    </w:p>
+    <w:p>
+      <w:pPr>
+        <w:pStyle w:val="ListParagraph"/>
+        <w:numPr>
+          <w:ilvl w:val="1"/>
+          <w:numId w:val="11"/>
+        </w:numPr>
+        <w:rPr>
+          <w:lang w:val="sv-SE"/>
+        </w:rPr>
+      </w:pPr>
+      <w:r>
+        <w:rPr>
+          <w:lang w:val="sv-SE"/>
+        </w:rPr>
+        <w:t xml:space="preserve">Begränsad </w:t>
+      </w:r>
+      <w:proofErr w:type="spellStart"/>
+      <w:r>
+        <w:rPr>
+          <w:lang w:val="sv-SE"/>
+        </w:rPr>
+        <w:t>parametrisering</w:t>
+      </w:r>
+      <w:proofErr w:type="spellEnd"/>
+      <w:r>
+        <w:rPr>
+          <w:lang w:val="sv-SE"/>
+        </w:rPr>
+        <w:t xml:space="preserve"> </w:t>
+      </w:r>
+    </w:p>
+    <w:p>
+      <w:pPr>
+        <w:pStyle w:val="ListParagraph"/>
+        <w:numPr>
+          <w:ilvl w:val="1"/>
+          <w:numId w:val="11"/>
+        </w:numPr>
+        <w:rPr>
+          <w:lang w:val="sv-SE"/>
+        </w:rPr>
+      </w:pPr>
+      <w:r>
+        <w:rPr>
+          <w:lang w:val="sv-SE"/>
+        </w:rPr>
+        <w:t>Mindre informativa felrapporter</w:t>
+      </w:r>
+    </w:p>
+    <w:p>
+      <w:pPr>
+        <w:pStyle w:val="ListParagraph"/>
+        <w:numPr>
+          <w:ilvl w:val="1"/>
+          <w:numId w:val="11"/>
+        </w:numPr>
+        <w:rPr>
+          <w:lang w:val="sv-SE"/>
+        </w:rPr>
+      </w:pPr>
+      <w:r>
+        <w:rPr>
+          <w:lang w:val="sv-SE"/>
+        </w:rPr>
+        <w:t>Mindre stöd för moderna testf</w:t>
+      </w:r>
+      <w:r>
+        <w:rPr>
+          <w:lang w:val="sv-SE"/>
+        </w:rPr>
+        <w:t>l</w:t>
+      </w:r>
+      <w:r>
+        <w:rPr>
+          <w:lang w:val="sv-SE"/>
+        </w:rPr>
+        <w:t>öden</w:t>
+      </w:r>
+    </w:p>
+    <w:p>
+      <w:pPr>
+        <w:rPr>
+          <w:lang w:val="sv-SE"/>
+        </w:rPr>
+      </w:pPr>
+    </w:p>
+    <w:p>
+      <w:pPr>
         <w:pStyle w:val="Heading2"/>
         <w:rPr>
           <w:lang w:val="sv-SE"/>
@@ -2861,8 +4069,190 @@
         <w:rPr>
           <w:lang w:val="sv-SE"/>
         </w:rPr>
-        <w:t>Sammanfattning</w:t>
-      </w:r>
+        <w:t>Hur teststrategi påverkar byggtid</w:t>
+      </w:r>
+    </w:p>
+    <w:p>
+      <w:pPr>
+        <w:rPr>
+          <w:lang w:val="sv-SE"/>
+        </w:rPr>
+      </w:pPr>
+      <w:r>
+        <w:rPr>
+          <w:lang w:val="sv-SE"/>
+        </w:rPr>
+        <w:t>I moderna utvecklingsprojekt är byggtid en viktig del av vardagen. Det är tiden från att kod skickas in tills man vet om något gick sönder. När byggtiden är kort får utvecklare snabb feedback och kan fortsätta arbeta utan avbrott. När den är lång skapar det frustration och bromsar hela teamet</w:t>
+      </w:r>
+      <w:r>
+        <w:rPr>
+          <w:lang w:val="sv-SE"/>
+        </w:rPr>
+        <w:t xml:space="preserve"> samt leveranser till slutkunden</w:t>
+      </w:r>
+      <w:r>
+        <w:rPr>
+          <w:lang w:val="sv-SE"/>
+        </w:rPr>
+        <w:t>.</w:t>
+      </w:r>
+    </w:p>
+    <w:p>
+      <w:pPr>
+        <w:rPr>
+          <w:lang w:val="sv-SE"/>
+        </w:rPr>
+      </w:pPr>
+      <w:r>
+        <w:rPr>
+          <w:lang w:val="sv-SE"/>
+        </w:rPr>
+        <w:t>En av de största faktorerna bakom byggtid är teststrategin</w:t>
+      </w:r>
+      <w:r>
+        <w:rPr>
+          <w:lang w:val="sv-SE"/>
+        </w:rPr>
+        <w:t>.</w:t>
+      </w:r>
+    </w:p>
+    <w:p>
+      <w:pPr>
+        <w:rPr>
+          <w:lang w:val="sv-SE"/>
+        </w:rPr>
+      </w:pPr>
+      <w:r>
+        <w:rPr>
+          <w:lang w:val="sv-SE"/>
+        </w:rPr>
+        <w:t xml:space="preserve">Alla tester är inte lika dyra. Enhetstester går snabbt och ger tidig feedback. UI-tester och mer omfattande integrationstester tar betydligt längre tid. </w:t>
+      </w:r>
+      <w:r>
+        <w:rPr>
+          <w:lang w:val="sv-SE"/>
+        </w:rPr>
+        <w:t>Om</w:t>
+      </w:r>
+      <w:r>
+        <w:rPr>
+          <w:lang w:val="sv-SE"/>
+        </w:rPr>
+        <w:t xml:space="preserve"> alla tester körs varje gång någon gör en liten ändring, blir byggtiden snabbt </w:t>
+      </w:r>
+      <w:r>
+        <w:rPr>
+          <w:lang w:val="sv-SE"/>
+        </w:rPr>
+        <w:t>väldigt</w:t>
+      </w:r>
+      <w:r>
+        <w:rPr>
+          <w:lang w:val="sv-SE"/>
+        </w:rPr>
+        <w:t xml:space="preserve"> lång.</w:t>
+      </w:r>
+    </w:p>
+    <w:p>
+      <w:pPr>
+        <w:rPr>
+          <w:lang w:val="sv-SE"/>
+        </w:rPr>
+      </w:pPr>
+      <w:r>
+        <w:rPr>
+          <w:lang w:val="sv-SE"/>
+        </w:rPr>
+        <w:t>Det</w:t>
+      </w:r>
+      <w:r>
+        <w:rPr>
+          <w:lang w:val="sv-SE"/>
+        </w:rPr>
+        <w:t>ta</w:t>
+      </w:r>
+      <w:r>
+        <w:rPr>
+          <w:lang w:val="sv-SE"/>
+        </w:rPr>
+        <w:t xml:space="preserve"> leder ofta till att utvecklare väntar längre på svar eller börjar ignorera CI-resultat, vilket i sin tur ökar risken för fel längre fram</w:t>
+      </w:r>
+      <w:r>
+        <w:rPr>
+          <w:lang w:val="sv-SE"/>
+        </w:rPr>
+        <w:t xml:space="preserve">. </w:t>
+      </w:r>
+    </w:p>
+    <w:p>
+      <w:pPr>
+        <w:rPr>
+          <w:lang w:val="sv-SE"/>
+        </w:rPr>
+      </w:pPr>
+      <w:r>
+        <w:rPr>
+          <w:lang w:val="sv-SE"/>
+        </w:rPr>
+        <w:t>En fungerande teststrategi handlar om balans. Snabba tester bör köras tidigt för att fånga enkla fel direkt. Tyngre tester bör köras mer sällan eller vid särskilda tillfällen, till exempel innan en större sammanslagning eller nattetid.</w:t>
+      </w:r>
+      <w:r>
+        <w:rPr>
+          <w:lang w:val="sv-SE"/>
+        </w:rPr>
+        <w:t xml:space="preserve"> </w:t>
+      </w:r>
+    </w:p>
+    <w:p>
+      <w:pPr>
+        <w:rPr>
+          <w:lang w:val="sv-SE"/>
+        </w:rPr>
+      </w:pPr>
+      <w:r>
+        <w:rPr>
+          <w:lang w:val="sv-SE"/>
+        </w:rPr>
+        <w:t>Genom att köra tester i rätt ordning och parallellt där det är möjligt kan byggtiden hållas nere utan att kvaliteten försämras</w:t>
+      </w:r>
+      <w:r>
+        <w:rPr>
+          <w:lang w:val="sv-SE"/>
+        </w:rPr>
+        <w:t>.</w:t>
+      </w:r>
+    </w:p>
+    <w:p>
+      <w:pPr>
+        <w:rPr>
+          <w:lang w:val="sv-SE"/>
+        </w:rPr>
+      </w:pPr>
+      <w:r>
+        <w:rPr>
+          <w:lang w:val="sv-SE"/>
+        </w:rPr>
+        <w:t xml:space="preserve">Byggtid är sällan ett tekniskt problem i sig. Det är oftast ett resultat av hur testerna används. En genomtänkt teststrategi ger snabbare feedback, mindre frustration och ett arbetsflöde som faktiskt hjälper utvecklarna </w:t>
+      </w:r>
+      <w:r>
+        <w:rPr>
+          <w:lang w:val="sv-SE"/>
+        </w:rPr>
+        <w:t>i stället</w:t>
+      </w:r>
+      <w:r>
+        <w:rPr>
+          <w:lang w:val="sv-SE"/>
+        </w:rPr>
+        <w:t xml:space="preserve"> för att stå i vägen.</w:t>
+      </w:r>
+    </w:p>
+    <w:p>
+      <w:pPr>
+        <w:rPr>
+          <w:lang w:val="en-SE"/>
+        </w:rPr>
+      </w:pPr>
     </w:p>
     <w:sectPr>
       <w:pgSz w:w="12240" w:h="15840"/>
@@ -3676,7 +5066,7 @@
   <w:style w:type="paragraph" w:default="1" w:styleId="Normal">
     <w:name w:val="Normal"/>
     <w:qFormat/>
-    <w:rsid w:val="00F96E42"/>
+    <w:rsid w:val="00A62A65"/>
   </w:style>
   <w:style w:type="paragraph" w:styleId="Heading1">
     <w:name w:val="heading 1"/>

</xml_diff>

<commit_message>
Changes made in Del-1: Rapport
</commit_message>
<xml_diff>
--- a/Del_1-Rapport/Del_1_Rapport.docx
+++ b/Del_1-Rapport/Del_1_Rapport.docx
@@ -1685,14 +1685,11 @@
     </w:p>
     <w:p>
       <w:r>
-        <w:rPr>
-          <w:noProof/>
-        </w:rPr>
         <w:drawing>
-          <wp:inline distT="0" distB="0" distL="0" distR="0" wp14:anchorId="1C384ECF" wp14:editId="53060F84">
-            <wp:extent cx="5135271" cy="2106295"/>
-            <wp:effectExtent l="0" t="0" r="8255" b="8255"/>
-            <wp:docPr id="439083793" name="Picture 1" descr="A white box with black text&#10;&#10;AI-generated content may be incorrect."/>
+          <wp:inline distT="0" distB="0" distL="0" distR="0" wp14:anchorId="7EB1051E" wp14:editId="20A29C59">
+            <wp:extent cx="5179060" cy="2106778"/>
+            <wp:effectExtent l="0" t="0" r="2540" b="8255"/>
+            <wp:docPr id="1099194576" name="Picture 1"/>
             <wp:cNvGraphicFramePr>
               <a:graphicFrameLocks xmlns:a="http://schemas.openxmlformats.org/drawingml/2006/main" noChangeAspect="1"/>
             </wp:cNvGraphicFramePr>
@@ -1700,7 +1697,7 @@
               <a:graphicData uri="http://schemas.openxmlformats.org/drawingml/2006/picture">
                 <pic:pic xmlns:pic="http://schemas.openxmlformats.org/drawingml/2006/picture">
                   <pic:nvPicPr>
-                    <pic:cNvPr id="439083793" name="Picture 1" descr="A white box with black text&#10;&#10;AI-generated content may be incorrect."/>
+                    <pic:cNvPr id="1099194576" name=""/>
                     <pic:cNvPicPr/>
                   </pic:nvPicPr>
                   <pic:blipFill>
@@ -1712,7 +1709,7 @@
                   <pic:spPr>
                     <a:xfrm>
                       <a:off x="0" y="0"/>
-                      <a:ext cx="5143024" cy="2109475"/>
+                      <a:ext cx="5208822" cy="2118885"/>
                     </a:xfrm>
                     <a:prstGeom prst="rect">
                       <a:avLst/>
@@ -1725,7 +1722,6 @@
         </w:drawing>
       </w:r>
     </w:p>
-    <w:p/>
     <w:p>
       <w:pPr>
         <w:rPr>
@@ -1738,6 +1734,7 @@
           <w:bCs/>
           <w:lang w:val="sv-SE"/>
         </w:rPr>
+        <w:lastRenderedPageBreak/>
         <w:t>Continuous Integration (CI)</w:t>
       </w:r>
       <w:r>
@@ -2320,7 +2317,6 @@
         <w:rPr>
           <w:lang w:val="sv-SE"/>
         </w:rPr>
-        <w:lastRenderedPageBreak/>
         <w:t>Pytest</w:t>
       </w:r>
       <w:proofErr w:type="spellEnd"/>
@@ -3161,7 +3157,6 @@
         <w:rPr>
           <w:lang w:val="sv-SE"/>
         </w:rPr>
-        <w:lastRenderedPageBreak/>
         <w:t>Flexibelt ramverk: Går att anpassa till många typer ab teststrategier och miljöer.</w:t>
       </w:r>
     </w:p>
@@ -3213,6 +3208,72 @@
     </w:p>
     <w:p>
       <w:pPr>
+        <w:rPr>
+          <w:b/>
+          <w:bCs/>
+          <w:i/>
+          <w:iCs/>
+          <w:lang w:val="sv-SE"/>
+        </w:rPr>
+      </w:pPr>
+      <w:r>
+        <w:rPr>
+          <w:b/>
+          <w:bCs/>
+          <w:i/>
+          <w:iCs/>
+          <w:lang w:val="sv-SE"/>
+        </w:rPr>
+        <w:lastRenderedPageBreak/>
+        <w:t>Nack</w:t>
+      </w:r>
+      <w:r>
+        <w:rPr>
+          <w:b/>
+          <w:bCs/>
+          <w:i/>
+          <w:iCs/>
+          <w:lang w:val="sv-SE"/>
+        </w:rPr>
+        <w:t xml:space="preserve">delar med </w:t>
+      </w:r>
+      <w:proofErr w:type="spellStart"/>
+      <w:r>
+        <w:rPr>
+          <w:b/>
+          <w:bCs/>
+          <w:i/>
+          <w:iCs/>
+          <w:lang w:val="sv-SE"/>
+        </w:rPr>
+        <w:t>Selenium</w:t>
+      </w:r>
+      <w:proofErr w:type="spellEnd"/>
+      <w:r>
+        <w:rPr>
+          <w:b/>
+          <w:bCs/>
+          <w:i/>
+          <w:iCs/>
+          <w:lang w:val="sv-SE"/>
+        </w:rPr>
+        <w:t xml:space="preserve"> + </w:t>
+      </w:r>
+      <w:proofErr w:type="spellStart"/>
+      <w:r>
+        <w:rPr>
+          <w:b/>
+          <w:bCs/>
+          <w:i/>
+          <w:iCs/>
+          <w:lang w:val="sv-SE"/>
+        </w:rPr>
+        <w:t>Pytest</w:t>
+      </w:r>
+      <w:proofErr w:type="spellEnd"/>
+    </w:p>
+    <w:p>
+      <w:pPr>
         <w:pStyle w:val="ListParagraph"/>
         <w:numPr>
           <w:ilvl w:val="1"/>
@@ -3222,71 +3283,24 @@
           <w:lang w:val="sv-SE"/>
         </w:rPr>
       </w:pPr>
-    </w:p>
-    <w:p>
-      <w:pPr>
-        <w:rPr>
-          <w:b/>
-          <w:bCs/>
-          <w:i/>
-          <w:iCs/>
-          <w:lang w:val="sv-SE"/>
-        </w:rPr>
-      </w:pPr>
-      <w:r>
-        <w:rPr>
-          <w:b/>
-          <w:bCs/>
-          <w:i/>
-          <w:iCs/>
-          <w:lang w:val="sv-SE"/>
-        </w:rPr>
-        <w:t>Nack</w:t>
-      </w:r>
-      <w:r>
-        <w:rPr>
-          <w:b/>
-          <w:bCs/>
-          <w:i/>
-          <w:iCs/>
-          <w:lang w:val="sv-SE"/>
-        </w:rPr>
-        <w:t xml:space="preserve">delar med </w:t>
-      </w:r>
-      <w:proofErr w:type="spellStart"/>
-      <w:r>
-        <w:rPr>
-          <w:b/>
-          <w:bCs/>
-          <w:i/>
-          <w:iCs/>
-          <w:lang w:val="sv-SE"/>
-        </w:rPr>
-        <w:t>Selenium</w:t>
-      </w:r>
-      <w:proofErr w:type="spellEnd"/>
-      <w:r>
-        <w:rPr>
-          <w:b/>
-          <w:bCs/>
-          <w:i/>
-          <w:iCs/>
-          <w:lang w:val="sv-SE"/>
-        </w:rPr>
-        <w:t xml:space="preserve"> + </w:t>
-      </w:r>
-      <w:proofErr w:type="spellStart"/>
-      <w:r>
-        <w:rPr>
-          <w:b/>
-          <w:bCs/>
-          <w:i/>
-          <w:iCs/>
-          <w:lang w:val="sv-SE"/>
-        </w:rPr>
-        <w:t>Pytest</w:t>
-      </w:r>
-      <w:proofErr w:type="spellEnd"/>
+      <w:r>
+        <w:rPr>
+          <w:lang w:val="sv-SE"/>
+        </w:rPr>
+        <w:t>Kräver mer konfiguration</w:t>
+      </w:r>
+      <w:r>
+        <w:rPr>
+          <w:lang w:val="sv-SE"/>
+        </w:rPr>
+        <w:t xml:space="preserve">: </w:t>
+      </w:r>
+      <w:r>
+        <w:rPr>
+          <w:lang w:val="sv-SE"/>
+        </w:rPr>
+        <w:t>Drivrutiner, versioner och miljöer måste hanteras aktivt.</w:t>
+      </w:r>
     </w:p>
     <w:p>
       <w:pPr>
@@ -3303,19 +3317,19 @@
         <w:rPr>
           <w:lang w:val="sv-SE"/>
         </w:rPr>
-        <w:t>Kräver mer konfiguration</w:t>
-      </w:r>
-      <w:r>
-        <w:rPr>
-          <w:lang w:val="sv-SE"/>
-        </w:rPr>
-        <w:t xml:space="preserve">: </w:t>
-      </w:r>
-      <w:r>
-        <w:rPr>
-          <w:lang w:val="sv-SE"/>
-        </w:rPr>
-        <w:t>Drivrutiner, versioner och miljöer måste hanteras aktivt.</w:t>
+        <w:t xml:space="preserve">Manuell vänte logik: </w:t>
+      </w:r>
+      <w:r>
+        <w:rPr>
+          <w:lang w:val="sv-SE"/>
+        </w:rPr>
+        <w:t>Testaren måste själv hantera timing och synkronisering</w:t>
+      </w:r>
+      <w:r>
+        <w:rPr>
+          <w:lang w:val="sv-SE"/>
+        </w:rPr>
+        <w:t>.</w:t>
       </w:r>
     </w:p>
     <w:p>
@@ -3333,19 +3347,13 @@
         <w:rPr>
           <w:lang w:val="sv-SE"/>
         </w:rPr>
-        <w:t xml:space="preserve">Manuell vänte logik: </w:t>
-      </w:r>
-      <w:r>
-        <w:rPr>
-          <w:lang w:val="sv-SE"/>
-        </w:rPr>
-        <w:t>Testaren måste själv hantera timing och synkronisering</w:t>
-      </w:r>
-      <w:r>
-        <w:rPr>
-          <w:lang w:val="sv-SE"/>
-        </w:rPr>
-        <w:t>.</w:t>
+        <w:t xml:space="preserve">Mer tid går till stabilisering: </w:t>
+      </w:r>
+      <w:r>
+        <w:rPr>
+          <w:lang w:val="sv-SE"/>
+        </w:rPr>
+        <w:t>UI-förändringar och timing problem orsakar ofta instabila tester.</w:t>
       </w:r>
     </w:p>
     <w:p>
@@ -3363,14 +3371,412 @@
         <w:rPr>
           <w:lang w:val="sv-SE"/>
         </w:rPr>
-        <w:t xml:space="preserve">Mer tid går till stabilisering: </w:t>
-      </w:r>
-      <w:r>
-        <w:rPr>
-          <w:lang w:val="sv-SE"/>
-        </w:rPr>
-        <w:t>UI-förändringar och timing problem orsakar ofta instabila tester.</w:t>
-      </w:r>
+        <w:t xml:space="preserve">Tester blir lätt instabila i CI-miljöer: </w:t>
+      </w:r>
+      <w:r>
+        <w:rPr>
+          <w:lang w:val="sv-SE"/>
+        </w:rPr>
+        <w:t>Tester blir längre och mer tekniskt detaljerade.</w:t>
+      </w:r>
+    </w:p>
+    <w:p>
+      <w:pPr>
+        <w:rPr>
+          <w:lang w:val="sv-SE"/>
+        </w:rPr>
+      </w:pPr>
+    </w:p>
+    <w:p>
+      <w:pPr>
+        <w:rPr>
+          <w:b/>
+          <w:bCs/>
+          <w:lang w:val="sv-SE"/>
+        </w:rPr>
+      </w:pPr>
+      <w:proofErr w:type="spellStart"/>
+      <w:r>
+        <w:rPr>
+          <w:b/>
+          <w:bCs/>
+          <w:lang w:val="sv-SE"/>
+        </w:rPr>
+        <w:t>Pytest</w:t>
+      </w:r>
+      <w:proofErr w:type="spellEnd"/>
+      <w:r>
+        <w:rPr>
+          <w:b/>
+          <w:bCs/>
+          <w:lang w:val="sv-SE"/>
+        </w:rPr>
+        <w:t xml:space="preserve">-grunden i testautomatiseringen </w:t>
+      </w:r>
+    </w:p>
+    <w:p>
+      <w:pPr>
+        <w:rPr>
+          <w:lang w:val="sv-SE"/>
+        </w:rPr>
+      </w:pPr>
+      <w:r>
+        <w:rPr>
+          <w:lang w:val="sv-SE"/>
+        </w:rPr>
+        <w:t xml:space="preserve">Pytest används som det grundläggande testramverk i projektet. </w:t>
+      </w:r>
+      <w:r>
+        <w:rPr>
+          <w:lang w:val="sv-SE"/>
+        </w:rPr>
+        <w:t xml:space="preserve">Det hanterar testkörning, </w:t>
+      </w:r>
+      <w:proofErr w:type="spellStart"/>
+      <w:r>
+        <w:rPr>
+          <w:lang w:val="sv-SE"/>
+        </w:rPr>
+        <w:t>assertioner</w:t>
+      </w:r>
+      <w:proofErr w:type="spellEnd"/>
+      <w:r>
+        <w:rPr>
+          <w:lang w:val="sv-SE"/>
+        </w:rPr>
+        <w:t xml:space="preserve"> och struktur, vilket gör det enkelt att skriva tydliga och fokuserade tester. </w:t>
+      </w:r>
+    </w:p>
+    <w:p>
+      <w:proofErr w:type="spellStart"/>
+      <w:r>
+        <w:t>Exempel</w:t>
+      </w:r>
+      <w:proofErr w:type="spellEnd"/>
+      <w:r>
+        <w:t xml:space="preserve"> </w:t>
+      </w:r>
+      <w:proofErr w:type="spellStart"/>
+      <w:r>
+        <w:t>från</w:t>
+      </w:r>
+      <w:proofErr w:type="spellEnd"/>
+      <w:r>
+        <w:t xml:space="preserve"> </w:t>
+      </w:r>
+      <w:proofErr w:type="spellStart"/>
+      <w:r>
+        <w:t>projektet</w:t>
+      </w:r>
+      <w:proofErr w:type="spellEnd"/>
+      <w:r>
+        <w:t xml:space="preserve">: </w:t>
+      </w:r>
+    </w:p>
+    <w:p>
+      <w:r>
+        <w:t>def test_get_products_returns_200():</w:t>
+      </w:r>
+    </w:p>
+    <w:p>
+      <w:r>
+        <w:t xml:space="preserve">    response = requests. </w:t>
+      </w:r>
+      <w:r>
+        <w:t>g</w:t>
+      </w:r>
+      <w:r>
+        <w:t>et(f"{BASE_URL}/products")</w:t>
+      </w:r>
+    </w:p>
+    <w:p>
+      <w:pPr>
+        <w:rPr>
+          <w:lang w:val="sv-SE"/>
+        </w:rPr>
+      </w:pPr>
+      <w:r>
+        <w:t xml:space="preserve">    </w:t>
+      </w:r>
+      <w:proofErr w:type="spellStart"/>
+      <w:r>
+        <w:rPr>
+          <w:lang w:val="sv-SE"/>
+        </w:rPr>
+        <w:t>assert</w:t>
+      </w:r>
+      <w:proofErr w:type="spellEnd"/>
+      <w:r>
+        <w:rPr>
+          <w:lang w:val="sv-SE"/>
+        </w:rPr>
+        <w:t xml:space="preserve"> </w:t>
+      </w:r>
+      <w:proofErr w:type="spellStart"/>
+      <w:r>
+        <w:rPr>
+          <w:lang w:val="sv-SE"/>
+        </w:rPr>
+        <w:t>response.status_code</w:t>
+      </w:r>
+      <w:proofErr w:type="spellEnd"/>
+      <w:r>
+        <w:rPr>
+          <w:lang w:val="sv-SE"/>
+        </w:rPr>
+        <w:t xml:space="preserve"> == 200</w:t>
+      </w:r>
+    </w:p>
+    <w:p>
+      <w:pPr>
+        <w:rPr>
+          <w:lang w:val="sv-SE"/>
+        </w:rPr>
+      </w:pPr>
+    </w:p>
+    <w:p>
+      <w:pPr>
+        <w:rPr>
+          <w:b/>
+          <w:bCs/>
+          <w:i/>
+          <w:iCs/>
+          <w:lang w:val="sv-SE"/>
+        </w:rPr>
+      </w:pPr>
+      <w:r>
+        <w:rPr>
+          <w:b/>
+          <w:bCs/>
+          <w:i/>
+          <w:iCs/>
+          <w:lang w:val="sv-SE"/>
+        </w:rPr>
+        <w:t>Fördelar med Pytest</w:t>
+      </w:r>
+    </w:p>
+    <w:p>
+      <w:pPr>
+        <w:rPr>
+          <w:lang w:val="sv-SE"/>
+        </w:rPr>
+      </w:pPr>
+      <w:r>
+        <w:rPr>
+          <w:lang w:val="sv-SE"/>
+        </w:rPr>
+        <w:t>Testfallen är</w:t>
+      </w:r>
+      <w:r>
+        <w:rPr>
+          <w:lang w:val="sv-SE"/>
+        </w:rPr>
+        <w:t xml:space="preserve"> korta och lätta att förstå, vilket gör dem enkla att underhålla över tid. De körs snabbt i CI och ger direkt feedback vid varje push. När ett test fallerar är det också lätt att se exakt vad som gått fel. Dessutom är testsviten enkel att bygga vidare på när nya funktioner tillkommer. </w:t>
+      </w:r>
+    </w:p>
+    <w:p>
+      <w:pPr>
+        <w:rPr>
+          <w:lang w:val="sv-SE"/>
+        </w:rPr>
+      </w:pPr>
+    </w:p>
+    <w:p>
+      <w:pPr>
+        <w:rPr>
+          <w:b/>
+          <w:bCs/>
+          <w:i/>
+          <w:iCs/>
+          <w:lang w:val="sv-SE"/>
+        </w:rPr>
+      </w:pPr>
+      <w:r>
+        <w:rPr>
+          <w:b/>
+          <w:bCs/>
+          <w:i/>
+          <w:iCs/>
+          <w:lang w:val="sv-SE"/>
+        </w:rPr>
+        <w:t>Nackdelar med Pytest</w:t>
+      </w:r>
+    </w:p>
+    <w:p>
+      <w:pPr>
+        <w:rPr>
+          <w:lang w:val="sv-SE"/>
+        </w:rPr>
+      </w:pPr>
+      <w:r>
+        <w:rPr>
+          <w:lang w:val="sv-SE"/>
+        </w:rPr>
+        <w:t>Pytest är begränsat till Python-projekt, och om testsviten växer utan tydlig struktur kan den bli svår att överblicka</w:t>
+      </w:r>
+      <w:r>
+        <w:rPr>
+          <w:lang w:val="sv-SE"/>
+        </w:rPr>
+        <w:t xml:space="preserve"> men i ett litet projekt som mitt Del-2&amp;3 projekt är lätt att hantera. </w:t>
+      </w:r>
+    </w:p>
+    <w:p>
+      <w:pPr>
+        <w:rPr>
+          <w:lang w:val="sv-SE"/>
+        </w:rPr>
+      </w:pPr>
+    </w:p>
+    <w:p>
+      <w:pPr>
+        <w:rPr>
+          <w:b/>
+          <w:bCs/>
+          <w:lang w:val="sv-SE"/>
+        </w:rPr>
+      </w:pPr>
+      <w:proofErr w:type="spellStart"/>
+      <w:r>
+        <w:rPr>
+          <w:b/>
+          <w:bCs/>
+          <w:lang w:val="sv-SE"/>
+        </w:rPr>
+        <w:t>Unittest</w:t>
+      </w:r>
+      <w:proofErr w:type="spellEnd"/>
+    </w:p>
+    <w:p>
+      <w:pPr>
+        <w:rPr>
+          <w:lang w:val="sv-SE"/>
+        </w:rPr>
+      </w:pPr>
+      <w:proofErr w:type="spellStart"/>
+      <w:r>
+        <w:rPr>
+          <w:lang w:val="sv-SE"/>
+        </w:rPr>
+        <w:t>Unittest</w:t>
+      </w:r>
+      <w:proofErr w:type="spellEnd"/>
+      <w:r>
+        <w:rPr>
+          <w:lang w:val="sv-SE"/>
+        </w:rPr>
+        <w:t xml:space="preserve"> är inspirerat av </w:t>
+      </w:r>
+      <w:proofErr w:type="spellStart"/>
+      <w:r>
+        <w:rPr>
+          <w:lang w:val="sv-SE"/>
+        </w:rPr>
+        <w:t>JUnit</w:t>
+      </w:r>
+      <w:proofErr w:type="spellEnd"/>
+      <w:r>
+        <w:rPr>
+          <w:lang w:val="sv-SE"/>
+        </w:rPr>
+        <w:t xml:space="preserve"> och bygger på klassbaserade tester med tydlig livscykel </w:t>
+      </w:r>
+      <w:r>
+        <w:rPr>
+          <w:lang w:val="sv-SE"/>
+        </w:rPr>
+        <w:t>(</w:t>
+      </w:r>
+      <w:proofErr w:type="spellStart"/>
+      <w:r>
+        <w:rPr>
+          <w:lang w:val="sv-SE"/>
+        </w:rPr>
+        <w:t>setUp</w:t>
+      </w:r>
+      <w:proofErr w:type="spellEnd"/>
+      <w:r>
+        <w:rPr>
+          <w:lang w:val="sv-SE"/>
+        </w:rPr>
+        <w:t xml:space="preserve">, </w:t>
+      </w:r>
+      <w:proofErr w:type="spellStart"/>
+      <w:r>
+        <w:rPr>
+          <w:lang w:val="sv-SE"/>
+        </w:rPr>
+        <w:t>tearDown</w:t>
+      </w:r>
+      <w:proofErr w:type="spellEnd"/>
+      <w:r>
+        <w:rPr>
+          <w:lang w:val="sv-SE"/>
+        </w:rPr>
+        <w:t>)</w:t>
+      </w:r>
+      <w:r>
+        <w:rPr>
+          <w:lang w:val="sv-SE"/>
+        </w:rPr>
+        <w:t>.</w:t>
+      </w:r>
+      <w:r>
+        <w:rPr>
+          <w:lang w:val="sv-SE"/>
+        </w:rPr>
+        <w:t xml:space="preserve"> </w:t>
+      </w:r>
+      <w:r>
+        <w:rPr>
+          <w:lang w:val="sv-SE"/>
+        </w:rPr>
+        <w:t>Strukturen är strikt och förutsägbar</w:t>
+      </w:r>
+    </w:p>
+    <w:p>
+      <w:pPr>
+        <w:rPr>
+          <w:b/>
+          <w:bCs/>
+          <w:i/>
+          <w:iCs/>
+          <w:lang w:val="sv-SE"/>
+        </w:rPr>
+      </w:pPr>
+      <w:r>
+        <w:rPr>
+          <w:b/>
+          <w:bCs/>
+          <w:i/>
+          <w:iCs/>
+          <w:lang w:val="sv-SE"/>
+        </w:rPr>
+        <w:lastRenderedPageBreak/>
+        <w:t xml:space="preserve">Fördelar med </w:t>
+      </w:r>
+      <w:proofErr w:type="spellStart"/>
+      <w:r>
+        <w:rPr>
+          <w:b/>
+          <w:bCs/>
+          <w:i/>
+          <w:iCs/>
+          <w:lang w:val="sv-SE"/>
+        </w:rPr>
+        <w:t>Unit</w:t>
+      </w:r>
+      <w:r>
+        <w:rPr>
+          <w:b/>
+          <w:bCs/>
+          <w:i/>
+          <w:iCs/>
+          <w:lang w:val="sv-SE"/>
+        </w:rPr>
+        <w:t>test</w:t>
+      </w:r>
+      <w:proofErr w:type="spellEnd"/>
     </w:p>
     <w:p>
       <w:pPr>
@@ -3387,412 +3793,22 @@
         <w:rPr>
           <w:lang w:val="sv-SE"/>
         </w:rPr>
-        <w:t xml:space="preserve">Tester blir lätt instabila i CI-miljöer: </w:t>
-      </w:r>
-      <w:r>
-        <w:rPr>
-          <w:lang w:val="sv-SE"/>
-        </w:rPr>
-        <w:t>Tester blir längre och mer tekniskt detaljerade.</w:t>
-      </w:r>
-    </w:p>
-    <w:p>
-      <w:pPr>
-        <w:rPr>
-          <w:lang w:val="sv-SE"/>
-        </w:rPr>
-      </w:pPr>
-    </w:p>
-    <w:p>
-      <w:pPr>
-        <w:rPr>
-          <w:b/>
-          <w:bCs/>
-          <w:lang w:val="sv-SE"/>
-        </w:rPr>
-      </w:pPr>
+        <w:t xml:space="preserve">Ingår i </w:t>
+      </w:r>
       <w:proofErr w:type="spellStart"/>
       <w:r>
         <w:rPr>
-          <w:b/>
-          <w:bCs/>
-          <w:lang w:val="sv-SE"/>
-        </w:rPr>
-        <w:t>Pytest</w:t>
+          <w:lang w:val="sv-SE"/>
+        </w:rPr>
+        <w:t>Python</w:t>
       </w:r>
       <w:proofErr w:type="spellEnd"/>
       <w:r>
         <w:rPr>
-          <w:b/>
-          <w:bCs/>
-          <w:lang w:val="sv-SE"/>
-        </w:rPr>
-        <w:t xml:space="preserve">-grunden i testautomatiseringen </w:t>
-      </w:r>
-    </w:p>
-    <w:p>
-      <w:pPr>
-        <w:rPr>
-          <w:lang w:val="sv-SE"/>
-        </w:rPr>
-      </w:pPr>
-      <w:r>
-        <w:rPr>
-          <w:lang w:val="sv-SE"/>
-        </w:rPr>
-        <w:t xml:space="preserve">Pytest används som det grundläggande testramverk i projektet. </w:t>
-      </w:r>
-      <w:r>
-        <w:rPr>
-          <w:lang w:val="sv-SE"/>
-        </w:rPr>
-        <w:t xml:space="preserve">Det hanterar testkörning, </w:t>
-      </w:r>
-      <w:proofErr w:type="spellStart"/>
-      <w:r>
-        <w:rPr>
-          <w:lang w:val="sv-SE"/>
-        </w:rPr>
-        <w:t>assertioner</w:t>
-      </w:r>
-      <w:proofErr w:type="spellEnd"/>
-      <w:r>
-        <w:rPr>
-          <w:lang w:val="sv-SE"/>
-        </w:rPr>
-        <w:t xml:space="preserve"> och struktur, vilket gör det enkelt att skriva tydliga och fokuserade tester. </w:t>
-      </w:r>
-    </w:p>
-    <w:p>
-      <w:proofErr w:type="spellStart"/>
-      <w:r>
-        <w:t>Exempel</w:t>
-      </w:r>
-      <w:proofErr w:type="spellEnd"/>
-      <w:r>
-        <w:t xml:space="preserve"> </w:t>
-      </w:r>
-      <w:proofErr w:type="spellStart"/>
-      <w:r>
-        <w:t>från</w:t>
-      </w:r>
-      <w:proofErr w:type="spellEnd"/>
-      <w:r>
-        <w:t xml:space="preserve"> </w:t>
-      </w:r>
-      <w:proofErr w:type="spellStart"/>
-      <w:r>
-        <w:t>projektet</w:t>
-      </w:r>
-      <w:proofErr w:type="spellEnd"/>
-      <w:r>
-        <w:t xml:space="preserve">: </w:t>
-      </w:r>
-    </w:p>
-    <w:p>
-      <w:r>
-        <w:t>def test_get_products_returns_200():</w:t>
-      </w:r>
-    </w:p>
-    <w:p>
-      <w:r>
-        <w:t xml:space="preserve">    response = requests. </w:t>
-      </w:r>
-      <w:r>
-        <w:t>g</w:t>
-      </w:r>
-      <w:r>
-        <w:t>et(f"{BASE_URL}/products")</w:t>
-      </w:r>
-    </w:p>
-    <w:p>
-      <w:pPr>
-        <w:rPr>
-          <w:lang w:val="sv-SE"/>
-        </w:rPr>
-      </w:pPr>
-      <w:r>
-        <w:t xml:space="preserve">    </w:t>
-      </w:r>
-      <w:proofErr w:type="spellStart"/>
-      <w:r>
-        <w:rPr>
-          <w:lang w:val="sv-SE"/>
-        </w:rPr>
-        <w:t>assert</w:t>
-      </w:r>
-      <w:proofErr w:type="spellEnd"/>
-      <w:r>
-        <w:rPr>
-          <w:lang w:val="sv-SE"/>
-        </w:rPr>
-        <w:t xml:space="preserve"> </w:t>
-      </w:r>
-      <w:proofErr w:type="spellStart"/>
-      <w:r>
-        <w:rPr>
-          <w:lang w:val="sv-SE"/>
-        </w:rPr>
-        <w:t>response.status_code</w:t>
-      </w:r>
-      <w:proofErr w:type="spellEnd"/>
-      <w:r>
-        <w:rPr>
-          <w:lang w:val="sv-SE"/>
-        </w:rPr>
-        <w:t xml:space="preserve"> == 200</w:t>
-      </w:r>
-    </w:p>
-    <w:p>
-      <w:pPr>
-        <w:rPr>
-          <w:lang w:val="sv-SE"/>
-        </w:rPr>
-      </w:pPr>
-    </w:p>
-    <w:p>
-      <w:pPr>
-        <w:rPr>
-          <w:b/>
-          <w:bCs/>
-          <w:i/>
-          <w:iCs/>
-          <w:lang w:val="sv-SE"/>
-        </w:rPr>
-      </w:pPr>
-      <w:r>
-        <w:rPr>
-          <w:b/>
-          <w:bCs/>
-          <w:i/>
-          <w:iCs/>
-          <w:lang w:val="sv-SE"/>
-        </w:rPr>
-        <w:t>Fördelar med Pytest</w:t>
-      </w:r>
-    </w:p>
-    <w:p>
-      <w:pPr>
-        <w:rPr>
-          <w:lang w:val="sv-SE"/>
-        </w:rPr>
-      </w:pPr>
-      <w:r>
-        <w:rPr>
-          <w:lang w:val="sv-SE"/>
-        </w:rPr>
-        <w:t>Testfallen är</w:t>
-      </w:r>
-      <w:r>
-        <w:rPr>
-          <w:lang w:val="sv-SE"/>
-        </w:rPr>
-        <w:t xml:space="preserve"> korta och lätta att förstå, vilket gör dem enkla att underhålla över tid. De körs snabbt i CI och ger direkt feedback vid varje push. När ett test fallerar är det också lätt att se exakt vad som gått fel. Dessutom är testsviten enkel att bygga vidare på när nya funktioner tillkommer. </w:t>
-      </w:r>
-    </w:p>
-    <w:p>
-      <w:pPr>
-        <w:rPr>
-          <w:lang w:val="sv-SE"/>
-        </w:rPr>
-      </w:pPr>
-    </w:p>
-    <w:p>
-      <w:pPr>
-        <w:rPr>
-          <w:b/>
-          <w:bCs/>
-          <w:i/>
-          <w:iCs/>
-          <w:lang w:val="sv-SE"/>
-        </w:rPr>
-      </w:pPr>
-      <w:r>
-        <w:rPr>
-          <w:b/>
-          <w:bCs/>
-          <w:i/>
-          <w:iCs/>
-          <w:lang w:val="sv-SE"/>
-        </w:rPr>
-        <w:t>Nackdelar med Pytest</w:t>
-      </w:r>
-    </w:p>
-    <w:p>
-      <w:pPr>
-        <w:rPr>
-          <w:lang w:val="sv-SE"/>
-        </w:rPr>
-      </w:pPr>
-      <w:r>
-        <w:rPr>
-          <w:lang w:val="sv-SE"/>
-        </w:rPr>
-        <w:t>Pytest är begränsat till Python-projekt, och om testsviten växer utan tydlig struktur kan den bli svår att överblicka</w:t>
-      </w:r>
-      <w:r>
-        <w:rPr>
-          <w:lang w:val="sv-SE"/>
-        </w:rPr>
-        <w:t xml:space="preserve"> men i ett litet projekt som mitt Del-2&amp;3 projekt är lätt att hantera. </w:t>
-      </w:r>
-    </w:p>
-    <w:p>
-      <w:pPr>
-        <w:rPr>
-          <w:lang w:val="sv-SE"/>
-        </w:rPr>
-      </w:pPr>
-    </w:p>
-    <w:p>
-      <w:pPr>
-        <w:rPr>
-          <w:b/>
-          <w:bCs/>
-          <w:lang w:val="sv-SE"/>
-        </w:rPr>
-      </w:pPr>
-      <w:proofErr w:type="spellStart"/>
-      <w:r>
-        <w:rPr>
-          <w:b/>
-          <w:bCs/>
-          <w:lang w:val="sv-SE"/>
-        </w:rPr>
-        <w:lastRenderedPageBreak/>
-        <w:t>Unittest</w:t>
-      </w:r>
-      <w:proofErr w:type="spellEnd"/>
-    </w:p>
-    <w:p>
-      <w:pPr>
-        <w:rPr>
-          <w:lang w:val="sv-SE"/>
-        </w:rPr>
-      </w:pPr>
-      <w:proofErr w:type="spellStart"/>
-      <w:r>
-        <w:rPr>
-          <w:lang w:val="sv-SE"/>
-        </w:rPr>
-        <w:t>Unittest</w:t>
-      </w:r>
-      <w:proofErr w:type="spellEnd"/>
-      <w:r>
-        <w:rPr>
-          <w:lang w:val="sv-SE"/>
-        </w:rPr>
-        <w:t xml:space="preserve"> är inspirerat av </w:t>
-      </w:r>
-      <w:proofErr w:type="spellStart"/>
-      <w:r>
-        <w:rPr>
-          <w:lang w:val="sv-SE"/>
-        </w:rPr>
-        <w:t>JUnit</w:t>
-      </w:r>
-      <w:proofErr w:type="spellEnd"/>
-      <w:r>
-        <w:rPr>
-          <w:lang w:val="sv-SE"/>
-        </w:rPr>
-        <w:t xml:space="preserve"> och bygger på klassbaserade tester med tydlig livscykel </w:t>
-      </w:r>
-      <w:r>
-        <w:rPr>
-          <w:lang w:val="sv-SE"/>
-        </w:rPr>
-        <w:t>(</w:t>
-      </w:r>
-      <w:proofErr w:type="spellStart"/>
-      <w:r>
-        <w:rPr>
-          <w:lang w:val="sv-SE"/>
-        </w:rPr>
-        <w:t>setUp</w:t>
-      </w:r>
-      <w:proofErr w:type="spellEnd"/>
-      <w:r>
-        <w:rPr>
-          <w:lang w:val="sv-SE"/>
-        </w:rPr>
-        <w:t xml:space="preserve">, </w:t>
-      </w:r>
-      <w:proofErr w:type="spellStart"/>
-      <w:r>
-        <w:rPr>
-          <w:lang w:val="sv-SE"/>
-        </w:rPr>
-        <w:t>tearDown</w:t>
-      </w:r>
-      <w:proofErr w:type="spellEnd"/>
-      <w:r>
-        <w:rPr>
-          <w:lang w:val="sv-SE"/>
-        </w:rPr>
-        <w:t>)</w:t>
-      </w:r>
-      <w:r>
-        <w:rPr>
-          <w:lang w:val="sv-SE"/>
-        </w:rPr>
-        <w:t>.</w:t>
-      </w:r>
-      <w:r>
-        <w:rPr>
-          <w:lang w:val="sv-SE"/>
-        </w:rPr>
-        <w:t xml:space="preserve"> </w:t>
-      </w:r>
-      <w:r>
-        <w:rPr>
-          <w:lang w:val="sv-SE"/>
-        </w:rPr>
-        <w:t>Strukturen är strikt och förutsägbar</w:t>
-      </w:r>
-    </w:p>
-    <w:p>
-      <w:pPr>
-        <w:rPr>
-          <w:b/>
-          <w:bCs/>
-          <w:i/>
-          <w:iCs/>
-          <w:lang w:val="sv-SE"/>
-        </w:rPr>
-      </w:pPr>
-      <w:r>
-        <w:rPr>
-          <w:b/>
-          <w:bCs/>
-          <w:i/>
-          <w:iCs/>
-          <w:lang w:val="sv-SE"/>
-        </w:rPr>
-        <w:t xml:space="preserve">Fördelar med </w:t>
-      </w:r>
-      <w:proofErr w:type="spellStart"/>
-      <w:r>
-        <w:rPr>
-          <w:b/>
-          <w:bCs/>
-          <w:i/>
-          <w:iCs/>
-          <w:lang w:val="sv-SE"/>
-        </w:rPr>
-        <w:t>Unit</w:t>
-      </w:r>
-      <w:r>
-        <w:rPr>
-          <w:b/>
-          <w:bCs/>
-          <w:i/>
-          <w:iCs/>
-          <w:lang w:val="sv-SE"/>
-        </w:rPr>
-        <w:t>test</w:t>
-      </w:r>
-      <w:proofErr w:type="spellEnd"/>
+          <w:lang w:val="sv-SE"/>
+        </w:rPr>
+        <w:t xml:space="preserve"> standardbibliotek </w:t>
+      </w:r>
     </w:p>
     <w:p>
       <w:pPr>
@@ -3809,21 +3825,7 @@
         <w:rPr>
           <w:lang w:val="sv-SE"/>
         </w:rPr>
-        <w:t xml:space="preserve">Ingår i </w:t>
-      </w:r>
-      <w:proofErr w:type="spellStart"/>
-      <w:r>
-        <w:rPr>
-          <w:lang w:val="sv-SE"/>
-        </w:rPr>
-        <w:t>Python</w:t>
-      </w:r>
-      <w:proofErr w:type="spellEnd"/>
-      <w:r>
-        <w:rPr>
-          <w:lang w:val="sv-SE"/>
-        </w:rPr>
-        <w:t xml:space="preserve"> standardbibliotek </w:t>
+        <w:t>Passar bra i mycket kontrollerade miljöer</w:t>
       </w:r>
     </w:p>
     <w:p>
@@ -3841,8 +3843,65 @@
         <w:rPr>
           <w:lang w:val="sv-SE"/>
         </w:rPr>
-        <w:t>Passar bra i mycket kontrollerade miljöer</w:t>
-      </w:r>
+        <w:t>Lätt att förstå för Java/</w:t>
+      </w:r>
+      <w:proofErr w:type="spellStart"/>
+      <w:r>
+        <w:rPr>
+          <w:lang w:val="sv-SE"/>
+        </w:rPr>
+        <w:t>Junit</w:t>
+      </w:r>
+      <w:proofErr w:type="spellEnd"/>
+      <w:r>
+        <w:rPr>
+          <w:lang w:val="sv-SE"/>
+        </w:rPr>
+        <w:t>-erfarna team</w:t>
+      </w:r>
+    </w:p>
+    <w:p>
+      <w:pPr>
+        <w:rPr>
+          <w:b/>
+          <w:bCs/>
+          <w:i/>
+          <w:iCs/>
+          <w:lang w:val="sv-SE"/>
+        </w:rPr>
+      </w:pPr>
+      <w:r>
+        <w:rPr>
+          <w:b/>
+          <w:bCs/>
+          <w:i/>
+          <w:iCs/>
+          <w:lang w:val="sv-SE"/>
+        </w:rPr>
+        <w:t xml:space="preserve">Nackdelar med </w:t>
+      </w:r>
+      <w:proofErr w:type="spellStart"/>
+      <w:r>
+        <w:rPr>
+          <w:b/>
+          <w:bCs/>
+          <w:i/>
+          <w:iCs/>
+          <w:lang w:val="sv-SE"/>
+        </w:rPr>
+        <w:t>Unit</w:t>
+      </w:r>
+      <w:r>
+        <w:rPr>
+          <w:b/>
+          <w:bCs/>
+          <w:i/>
+          <w:iCs/>
+          <w:lang w:val="sv-SE"/>
+        </w:rPr>
+        <w:t>test</w:t>
+      </w:r>
+      <w:proofErr w:type="spellEnd"/>
     </w:p>
     <w:p>
       <w:pPr>
@@ -3859,65 +3918,22 @@
         <w:rPr>
           <w:lang w:val="sv-SE"/>
         </w:rPr>
-        <w:t>Lätt att förstå för Java/</w:t>
+        <w:t xml:space="preserve">Begränsad </w:t>
       </w:r>
       <w:proofErr w:type="spellStart"/>
       <w:r>
         <w:rPr>
           <w:lang w:val="sv-SE"/>
         </w:rPr>
-        <w:t>Junit</w:t>
+        <w:t>parametrisering</w:t>
       </w:r>
       <w:proofErr w:type="spellEnd"/>
       <w:r>
         <w:rPr>
           <w:lang w:val="sv-SE"/>
         </w:rPr>
-        <w:t>-erfarna team</w:t>
-      </w:r>
-    </w:p>
-    <w:p>
-      <w:pPr>
-        <w:rPr>
-          <w:b/>
-          <w:bCs/>
-          <w:i/>
-          <w:iCs/>
-          <w:lang w:val="sv-SE"/>
-        </w:rPr>
-      </w:pPr>
-      <w:r>
-        <w:rPr>
-          <w:b/>
-          <w:bCs/>
-          <w:i/>
-          <w:iCs/>
-          <w:lang w:val="sv-SE"/>
-        </w:rPr>
-        <w:t xml:space="preserve">Nackdelar med </w:t>
-      </w:r>
-      <w:proofErr w:type="spellStart"/>
-      <w:r>
-        <w:rPr>
-          <w:b/>
-          <w:bCs/>
-          <w:i/>
-          <w:iCs/>
-          <w:lang w:val="sv-SE"/>
-        </w:rPr>
-        <w:t>Unit</w:t>
-      </w:r>
-      <w:r>
-        <w:rPr>
-          <w:b/>
-          <w:bCs/>
-          <w:i/>
-          <w:iCs/>
-          <w:lang w:val="sv-SE"/>
-        </w:rPr>
-        <w:t>test</w:t>
-      </w:r>
-      <w:proofErr w:type="spellEnd"/>
+        <w:t xml:space="preserve"> </w:t>
+      </w:r>
     </w:p>
     <w:p>
       <w:pPr>
@@ -3934,21 +3950,7 @@
         <w:rPr>
           <w:lang w:val="sv-SE"/>
         </w:rPr>
-        <w:t xml:space="preserve">Begränsad </w:t>
-      </w:r>
-      <w:proofErr w:type="spellStart"/>
-      <w:r>
-        <w:rPr>
-          <w:lang w:val="sv-SE"/>
-        </w:rPr>
-        <w:t>parametrisering</w:t>
-      </w:r>
-      <w:proofErr w:type="spellEnd"/>
-      <w:r>
-        <w:rPr>
-          <w:lang w:val="sv-SE"/>
-        </w:rPr>
-        <w:t xml:space="preserve"> </w:t>
+        <w:t>Mindre informativa felrapporter</w:t>
       </w:r>
     </w:p>
     <w:p>
@@ -3966,64 +3968,73 @@
         <w:rPr>
           <w:lang w:val="sv-SE"/>
         </w:rPr>
-        <w:t>Mindre informativa felrapporter</w:t>
+        <w:t>Mindre stöd för moderna testf</w:t>
+      </w:r>
+      <w:r>
+        <w:rPr>
+          <w:lang w:val="sv-SE"/>
+        </w:rPr>
+        <w:t>l</w:t>
+      </w:r>
+      <w:r>
+        <w:rPr>
+          <w:lang w:val="sv-SE"/>
+        </w:rPr>
+        <w:t>öden</w:t>
       </w:r>
     </w:p>
     <w:p>
       <w:pPr>
         <w:pStyle w:val="ListParagraph"/>
-        <w:numPr>
-          <w:ilvl w:val="1"/>
-          <w:numId w:val="11"/>
-        </w:numPr>
-        <w:rPr>
-          <w:lang w:val="sv-SE"/>
-        </w:rPr>
-      </w:pPr>
-      <w:r>
-        <w:rPr>
-          <w:lang w:val="sv-SE"/>
-        </w:rPr>
-        <w:t>Mindre stöd för moderna testf</w:t>
-      </w:r>
-      <w:r>
-        <w:rPr>
-          <w:lang w:val="sv-SE"/>
-        </w:rPr>
-        <w:t>l</w:t>
-      </w:r>
-      <w:r>
-        <w:rPr>
-          <w:lang w:val="sv-SE"/>
-        </w:rPr>
-        <w:t>öden</w:t>
-      </w:r>
+        <w:ind w:left="1440"/>
+        <w:rPr>
+          <w:lang w:val="sv-SE"/>
+        </w:rPr>
+      </w:pPr>
     </w:p>
     <w:p>
       <w:pPr>
-        <w:rPr>
-          <w:lang w:val="sv-SE"/>
-        </w:rPr>
-      </w:pPr>
+        <w:pStyle w:val="Heading3"/>
+        <w:rPr>
+          <w:lang w:val="sv-SE"/>
+        </w:rPr>
+      </w:pPr>
+      <w:r>
+        <w:rPr>
+          <w:lang w:val="sv-SE"/>
+        </w:rPr>
+        <w:t>Hur teststrategi påverkar byggtid</w:t>
+      </w:r>
+      <w:r>
+        <w:rPr>
+          <w:lang w:val="sv-SE"/>
+        </w:rPr>
+        <w:t>?</w:t>
+      </w:r>
     </w:p>
     <w:p>
       <w:pPr>
-        <w:pStyle w:val="Heading3"/>
-        <w:rPr>
-          <w:lang w:val="sv-SE"/>
-        </w:rPr>
-      </w:pPr>
-      <w:r>
-        <w:rPr>
-          <w:lang w:val="sv-SE"/>
-        </w:rPr>
-        <w:t>Hur teststrategi påverkar byggtid</w:t>
-      </w:r>
-      <w:r>
-        <w:rPr>
-          <w:lang w:val="sv-SE"/>
-        </w:rPr>
-        <w:t>?</w:t>
+        <w:rPr>
+          <w:lang w:val="sv-SE"/>
+        </w:rPr>
+      </w:pPr>
+      <w:r>
+        <w:rPr>
+          <w:lang w:val="sv-SE"/>
+        </w:rPr>
+        <w:t>I moderna utvecklingsprojekt är byggtid en viktig del av vardagen. Det är tiden från att kod skickas in tills man vet om något gick sönder. När byggtiden är kort får utvecklare snabb feedback och kan fortsätta arbeta utan avbrott. När den är lång skapar det frustration och bromsar hela teamet</w:t>
+      </w:r>
+      <w:r>
+        <w:rPr>
+          <w:lang w:val="sv-SE"/>
+        </w:rPr>
+        <w:t xml:space="preserve"> samt leveranser till slutkunden</w:t>
+      </w:r>
+      <w:r>
+        <w:rPr>
+          <w:lang w:val="sv-SE"/>
+        </w:rPr>
+        <w:t>.</w:t>
       </w:r>
     </w:p>
     <w:p>
@@ -4032,6 +4043,18 @@
           <w:lang w:val="sv-SE"/>
         </w:rPr>
       </w:pPr>
+      <w:r>
+        <w:rPr>
+          <w:lang w:val="sv-SE"/>
+        </w:rPr>
+        <w:t>En av de största faktorerna bakom byggtid är teststrategin</w:t>
+      </w:r>
+      <w:r>
+        <w:rPr>
+          <w:lang w:val="sv-SE"/>
+        </w:rPr>
+        <w:t>.</w:t>
+      </w:r>
     </w:p>
     <w:p>
       <w:pPr>
@@ -4043,19 +4066,7 @@
         <w:rPr>
           <w:lang w:val="sv-SE"/>
         </w:rPr>
-        <w:t>I moderna utvecklingsprojekt är byggtid en viktig del av vardagen. Det är tiden från att kod skickas in tills man vet om något gick sönder. När byggtiden är kort får utvecklare snabb feedback och kan fortsätta arbeta utan avbrott. När den är lång skapar det frustration och bromsar hela teamet</w:t>
-      </w:r>
-      <w:r>
-        <w:rPr>
-          <w:lang w:val="sv-SE"/>
-        </w:rPr>
-        <w:t xml:space="preserve"> samt leveranser till slutkunden</w:t>
-      </w:r>
-      <w:r>
-        <w:rPr>
-          <w:lang w:val="sv-SE"/>
-        </w:rPr>
-        <w:t>.</w:t>
+        <w:t>Alla tester är inte lika dyra. Enhetstester går snabbt och ger tidig feedback. UI-tester och mer omfattande integrationstester tar betydligt längre tid. Om alla tester körs varje gång någon gör en liten ändring, blir byggtiden snabbt väldigt lång.</w:t>
       </w:r>
     </w:p>
     <w:p>
@@ -4068,13 +4079,7 @@
         <w:rPr>
           <w:lang w:val="sv-SE"/>
         </w:rPr>
-        <w:t>En av de största faktorerna bakom byggtid är teststrategin</w:t>
-      </w:r>
-      <w:r>
-        <w:rPr>
-          <w:lang w:val="sv-SE"/>
-        </w:rPr>
-        <w:t>.</w:t>
+        <w:t xml:space="preserve">Detta leder ofta till att utvecklare väntar längre på svar eller börjar ignorera CI-resultat, vilket i sin tur ökar risken för fel längre fram. </w:t>
       </w:r>
     </w:p>
     <w:p>
@@ -4087,7 +4092,7 @@
         <w:rPr>
           <w:lang w:val="sv-SE"/>
         </w:rPr>
-        <w:t>Alla tester är inte lika dyra. Enhetstester går snabbt och ger tidig feedback. UI-tester och mer omfattande integrationstester tar betydligt längre tid. Om alla tester körs varje gång någon gör en liten ändring, blir byggtiden snabbt väldigt lång.</w:t>
+        <w:t xml:space="preserve">En fungerande teststrategi handlar om balans. Snabba tester bör köras tidigt för att fånga enkla fel direkt. Tyngre tester bör köras mer sällan eller vid särskilda tillfällen, till exempel innan en större sammanslagning eller nattetid. </w:t>
       </w:r>
     </w:p>
     <w:p>
@@ -4100,7 +4105,7 @@
         <w:rPr>
           <w:lang w:val="sv-SE"/>
         </w:rPr>
-        <w:t xml:space="preserve">Detta leder ofta till att utvecklare väntar längre på svar eller börjar ignorera CI-resultat, vilket i sin tur ökar risken för fel längre fram. </w:t>
+        <w:t>Genom att köra tester i rätt ordning och parallellt där det är möjligt kan byggtiden hållas nere utan att kvaliteten försämras.</w:t>
       </w:r>
     </w:p>
     <w:p>
@@ -4113,7 +4118,7 @@
         <w:rPr>
           <w:lang w:val="sv-SE"/>
         </w:rPr>
-        <w:t xml:space="preserve">En fungerande teststrategi handlar om balans. Snabba tester bör köras tidigt för att fånga enkla fel direkt. Tyngre tester bör köras mer sällan eller vid särskilda tillfällen, till exempel innan en större sammanslagning eller nattetid. </w:t>
+        <w:t>Byggtid är sällan ett tekniskt problem i sig. Det är oftast ett resultat av hur testerna används. En genomtänkt teststrategi ger snabbare feedback, mindre frustration och ett arbetsflöde som faktiskt hjälper utvecklarna i stället för att stå i vägen.</w:t>
       </w:r>
     </w:p>
     <w:p>
@@ -4122,12 +4127,6 @@
           <w:lang w:val="sv-SE"/>
         </w:rPr>
       </w:pPr>
-      <w:r>
-        <w:rPr>
-          <w:lang w:val="sv-SE"/>
-        </w:rPr>
-        <w:t>Genom att köra tester i rätt ordning och parallellt där det är möjligt kan byggtiden hållas nere utan att kvaliteten försämras.</w:t>
-      </w:r>
     </w:p>
     <w:p>
       <w:pPr>
@@ -4137,17 +4136,67 @@
       </w:pPr>
       <w:r>
         <w:rPr>
-          <w:lang w:val="sv-SE"/>
-        </w:rPr>
-        <w:t>Byggtid är sällan ett tekniskt problem i sig. Det är oftast ett resultat av hur testerna används. En genomtänkt teststrategi ger snabbare feedback, mindre frustration och ett arbetsflöde som faktiskt hjälper utvecklarna i stället för att stå i vägen.</w:t>
-      </w:r>
-    </w:p>
-    <w:p>
-      <w:pPr>
-        <w:rPr>
-          <w:lang w:val="en-SE"/>
-        </w:rPr>
-      </w:pPr>
+          <w:rStyle w:val="Heading1Char"/>
+          <w:lang w:val="sv-SE"/>
+        </w:rPr>
+        <w:t xml:space="preserve">Del 2 &amp; 3: </w:t>
+      </w:r>
+      <w:proofErr w:type="spellStart"/>
+      <w:r>
+        <w:rPr>
+          <w:rStyle w:val="Heading1Char"/>
+          <w:lang w:val="sv-SE"/>
+        </w:rPr>
+        <w:t>GitHub</w:t>
+      </w:r>
+      <w:proofErr w:type="spellEnd"/>
+      <w:r>
+        <w:rPr>
+          <w:rStyle w:val="Heading1Char"/>
+          <w:lang w:val="sv-SE"/>
+        </w:rPr>
+        <w:t xml:space="preserve"> länk:</w:t>
+      </w:r>
+      <w:r>
+        <w:rPr>
+          <w:lang w:val="sv-SE"/>
+        </w:rPr>
+        <w:t xml:space="preserve"> </w:t>
+      </w:r>
+      <w:hyperlink r:id="rId7" w:history="1">
+        <w:proofErr w:type="spellStart"/>
+        <w:r>
+          <w:rPr>
+            <w:rStyle w:val="Hyperlink"/>
+            <w:lang w:val="sv-SE"/>
+          </w:rPr>
+          <w:t>Ebesoh</w:t>
+        </w:r>
+        <w:proofErr w:type="spellEnd"/>
+        <w:r>
+          <w:rPr>
+            <w:rStyle w:val="Hyperlink"/>
+            <w:lang w:val="sv-SE"/>
+          </w:rPr>
+          <w:t>/</w:t>
+        </w:r>
+        <w:proofErr w:type="spellStart"/>
+        <w:r>
+          <w:rPr>
+            <w:rStyle w:val="Hyperlink"/>
+            <w:lang w:val="sv-SE"/>
+          </w:rPr>
+          <w:t>InlamningsUppgift_TA</w:t>
+        </w:r>
+        <w:proofErr w:type="spellEnd"/>
+        <w:r>
+          <w:rPr>
+            <w:rStyle w:val="Hyperlink"/>
+            <w:lang w:val="sv-SE"/>
+          </w:rPr>
+          <w:t>: Inlämningsuppgift till Test Automatisering EC Utbildning</w:t>
+        </w:r>
+      </w:hyperlink>
     </w:p>
     <w:sectPr>
       <w:pgSz w:w="12240" w:h="15840"/>
@@ -15950,6 +15999,41 @@
       </w:tcPr>
     </w:tblStylePr>
   </w:style>
+  <w:style w:type="character" w:styleId="Hyperlink">
+    <w:name w:val="Hyperlink"/>
+    <w:basedOn w:val="DefaultParagraphFont"/>
+    <w:uiPriority w:val="99"/>
+    <w:unhideWhenUsed/>
+    <w:rsid w:val="004C1DB3"/>
+    <w:rPr>
+      <w:color w:val="0000FF" w:themeColor="hyperlink"/>
+      <w:u w:val="single"/>
+    </w:rPr>
+  </w:style>
+  <w:style w:type="character" w:styleId="UnresolvedMention">
+    <w:name w:val="Unresolved Mention"/>
+    <w:basedOn w:val="DefaultParagraphFont"/>
+    <w:uiPriority w:val="99"/>
+    <w:semiHidden/>
+    <w:unhideWhenUsed/>
+    <w:rsid w:val="004C1DB3"/>
+    <w:rPr>
+      <w:color w:val="605E5C"/>
+      <w:shd w:val="clear" w:color="auto" w:fill="E1DFDD"/>
+    </w:rPr>
+  </w:style>
+  <w:style w:type="character" w:styleId="FollowedHyperlink">
+    <w:name w:val="FollowedHyperlink"/>
+    <w:basedOn w:val="DefaultParagraphFont"/>
+    <w:uiPriority w:val="99"/>
+    <w:semiHidden/>
+    <w:unhideWhenUsed/>
+    <w:rsid w:val="004C1DB3"/>
+    <w:rPr>
+      <w:color w:val="800080" w:themeColor="followedHyperlink"/>
+      <w:u w:val="single"/>
+    </w:rPr>
+  </w:style>
 </w:styles>
 </file>
 

</xml_diff>